<commit_message>
feat: validate private CV profile workflow
</commit_message>
<xml_diff>
--- a/output/docs/ProfileKit_Project_Introduction.docx
+++ b/output/docs/ProfileKit_Project_Introduction.docx
@@ -7,7 +7,7 @@
         <w:pStyle w:val="Title"/>
       </w:pPr>
       <w:r>
-        <w:t>ProfileKit Project Introduction and Demonstration Guide</w:t>
+        <w:t>ProfileKit Project Introduction</w:t>
       </w:r>
     </w:p>
     <w:p>
@@ -15,9 +15,9 @@
         <w:rPr>
           <w:rFonts w:ascii="Aptos" w:hAnsi="Aptos"/>
           <w:color w:val="000000"/>
-          <w:sz w:val="28"/>
+          <w:sz w:val="23"/>
         </w:rPr>
-        <w:t>A privacy conscious local agent for editable single page personal profiles</w:t>
+        <w:t>A privacy-conscious local agent for editable single-page personal profiles</w:t>
       </w:r>
     </w:p>
     <w:p>
@@ -25,18 +25,18 @@
         <w:rPr>
           <w:rFonts w:ascii="Aptos" w:hAnsi="Aptos"/>
           <w:color w:val="000000"/>
-          <w:sz w:val="20"/>
+          <w:sz w:val="17"/>
         </w:rPr>
-        <w:t>Prepared for an in-class project demonstration</w:t>
+        <w:t>Purpose, core functions, and classroom demonstration appendix</w:t>
         <w:br/>
       </w:r>
       <w:r>
         <w:rPr>
           <w:rFonts w:ascii="Aptos" w:hAnsi="Aptos"/>
           <w:color w:val="000000"/>
-          <w:sz w:val="20"/>
+          <w:sz w:val="17"/>
         </w:rPr>
-        <w:t>Current implementation status: locally runnable and tested</w:t>
+        <w:t>Current status: locally runnable and tested</w:t>
       </w:r>
     </w:p>
     <w:p>
@@ -45,7 +45,7 @@
         <w:keepNext/>
       </w:pPr>
       <w:r>
-        <w:t>Project Overview</w:t>
+        <w:t>Purpose and Motivation</w:t>
       </w:r>
     </w:p>
     <w:p>
@@ -53,7 +53,15 @@
         <w:keepLines/>
       </w:pPr>
       <w:r>
-        <w:t>ProfileKit is a local, privacy-conscious conversational agent that helps a user turn approved personal information into an editable, audience-specific, single-page profile. The current version runs as a local web application, accepts source documents and structured configuration, supports low-cost model selection, keeps a reviewable profile record, provides live visual customization, and exports a one-page PDF. The implementation is ready for a classroom demonstration, while the user remains responsible for reviewing facts, privacy choices, permissions, and final use.</w:t>
+        <w:t>My goal is to build a practical agent that helps students, researchers, and early-career professionals turn their own approved information into a concise, attractive profile. A conventional resume is often too long for a class introduction, conference page, or project showcase, while an unrestricted AI tool may invent claims or expose details that are unsuitable for a public audience. ProfileKit therefore combines language-model assistance with explicit review, privacy, and design controls.</w:t>
+      </w:r>
+    </w:p>
+    <w:p>
+      <w:pPr>
+        <w:keepLines/>
+      </w:pPr>
+      <w:r>
+        <w:t>The current version runs as a local web application. It keeps the API keys on the server, stores the working session locally, distinguishes source facts from suggested wording, and lets the user decide what appears in the final one-page PDF. It is intended as a classroom-ready prototype, not an automatic publishing or identity-verification service.</w:t>
       </w:r>
     </w:p>
     <w:p>
@@ -62,7 +70,7 @@
         <w:keepNext/>
       </w:pPr>
       <w:r>
-        <w:t>Problem and Motivation</w:t>
+        <w:t>How the Agent Works</w:t>
       </w:r>
     </w:p>
     <w:p>
@@ -70,7 +78,7 @@
         <w:keepLines/>
       </w:pPr>
       <w:r>
-        <w:t>Creating a short personal profile is deceptively difficult. A resume may contain too much information, personal details may not be suitable for every audience, and a generic language model may invent stronger claims or overlook permissions. ProfileKit addresses this problem by separating evidence, suggested wording, privacy decisions, design preferences, and final export. It is designed for students, early-career professionals, researchers, applicants, and conference participants who need a concise profile without losing control of their information.</w:t>
+        <w:t>Input documents and user preferences are reviewed by the model and converted into structured profile items. A deterministic controller enforces approval stages; the user resolves sensitive or uncertain content, then the live preview and PDF use the same approved record and design settings.</w:t>
       </w:r>
     </w:p>
     <w:p>
@@ -79,56 +87,355 @@
         <w:keepNext/>
       </w:pPr>
       <w:r>
-        <w:t>Project Goals</w:t>
+        <w:t>Core Functions</w:t>
       </w:r>
     </w:p>
+    <w:tbl>
+      <w:tblPr>
+        <w:tblW w:type="auto" w:w="0"/>
+        <w:tblLayout w:type="fixed"/>
+        <w:tblLook w:firstColumn="1" w:firstRow="1" w:lastColumn="0" w:lastRow="0" w:noHBand="0" w:noVBand="1" w:val="04A0"/>
+      </w:tblPr>
+      <w:tblGrid>
+        <w:gridCol w:w="5083"/>
+        <w:gridCol w:w="5083"/>
+      </w:tblGrid>
+      <w:tr>
+        <w:trPr>
+          <w:tblHeader/>
+        </w:trPr>
+        <w:tc>
+          <w:tcPr>
+            <w:tcW w:type="dxa" w:w="1944"/>
+            <w:shd w:fill="1F3A5F"/>
+            <w:tcBorders>
+              <w:top w:val="single" w:sz="4" w:color="D9D9D9"/>
+              <w:left w:val="single" w:sz="4" w:color="D9D9D9"/>
+              <w:bottom w:val="single" w:sz="4" w:color="D9D9D9"/>
+              <w:right w:val="single" w:sz="4" w:color="D9D9D9"/>
+              <w:insideH w:val="single" w:sz="4" w:color="D9D9D9"/>
+              <w:insideV w:val="single" w:sz="4" w:color="D9D9D9"/>
+            </w:tcBorders>
+            <w:tcMar>
+              <w:top w:w="70" w:type="dxa"/>
+              <w:start w:w="105" w:type="dxa"/>
+              <w:bottom w:w="70" w:type="dxa"/>
+              <w:end w:w="105" w:type="dxa"/>
+            </w:tcMar>
+            <w:vAlign w:val="center"/>
+          </w:tcPr>
+          <w:p>
+            <w:pPr>
+              <w:jc w:val="left"/>
+            </w:pPr>
+            <w:r>
+              <w:rPr>
+                <w:rFonts w:ascii="Aptos" w:hAnsi="Aptos"/>
+                <w:b/>
+                <w:color w:val="FFFFFF"/>
+                <w:sz w:val="17"/>
+              </w:rPr>
+              <w:t>Function</w:t>
+            </w:r>
+          </w:p>
+        </w:tc>
+        <w:tc>
+          <w:tcPr>
+            <w:tcW w:type="dxa" w:w="7848"/>
+            <w:shd w:fill="1F3A5F"/>
+            <w:tcBorders>
+              <w:top w:val="single" w:sz="4" w:color="D9D9D9"/>
+              <w:left w:val="single" w:sz="4" w:color="D9D9D9"/>
+              <w:bottom w:val="single" w:sz="4" w:color="D9D9D9"/>
+              <w:right w:val="single" w:sz="4" w:color="D9D9D9"/>
+              <w:insideH w:val="single" w:sz="4" w:color="D9D9D9"/>
+              <w:insideV w:val="single" w:sz="4" w:color="D9D9D9"/>
+            </w:tcBorders>
+            <w:tcMar>
+              <w:top w:w="70" w:type="dxa"/>
+              <w:start w:w="105" w:type="dxa"/>
+              <w:bottom w:w="70" w:type="dxa"/>
+              <w:end w:w="105" w:type="dxa"/>
+            </w:tcMar>
+            <w:vAlign w:val="center"/>
+          </w:tcPr>
+          <w:p>
+            <w:pPr>
+              <w:jc w:val="left"/>
+            </w:pPr>
+            <w:r>
+              <w:rPr>
+                <w:rFonts w:ascii="Aptos" w:hAnsi="Aptos"/>
+                <w:b/>
+                <w:color w:val="FFFFFF"/>
+                <w:sz w:val="17"/>
+              </w:rPr>
+              <w:t>What the user can do</w:t>
+            </w:r>
+          </w:p>
+        </w:tc>
+      </w:tr>
+      <w:tr>
+        <w:trPr>
+          <w:cantSplit/>
+        </w:trPr>
+        <w:tc>
+          <w:tcPr>
+            <w:tcW w:type="dxa" w:w="1944"/>
+            <w:tcBorders>
+              <w:top w:val="single" w:sz="4" w:color="D9D9D9"/>
+              <w:left w:val="single" w:sz="4" w:color="D9D9D9"/>
+              <w:bottom w:val="single" w:sz="4" w:color="D9D9D9"/>
+              <w:right w:val="single" w:sz="4" w:color="D9D9D9"/>
+              <w:insideH w:val="single" w:sz="4" w:color="D9D9D9"/>
+              <w:insideV w:val="single" w:sz="4" w:color="D9D9D9"/>
+            </w:tcBorders>
+            <w:tcMar>
+              <w:top w:w="70" w:type="dxa"/>
+              <w:start w:w="105" w:type="dxa"/>
+              <w:bottom w:w="70" w:type="dxa"/>
+              <w:end w:w="105" w:type="dxa"/>
+            </w:tcMar>
+            <w:vAlign w:val="center"/>
+          </w:tcPr>
+          <w:p>
+            <w:r>
+              <w:rPr>
+                <w:rFonts w:ascii="Aptos" w:hAnsi="Aptos"/>
+                <w:sz w:val="17"/>
+              </w:rPr>
+              <w:t>Flexible input</w:t>
+            </w:r>
+          </w:p>
+        </w:tc>
+        <w:tc>
+          <w:tcPr>
+            <w:tcW w:type="dxa" w:w="7848"/>
+            <w:tcBorders>
+              <w:top w:val="single" w:sz="4" w:color="D9D9D9"/>
+              <w:left w:val="single" w:sz="4" w:color="D9D9D9"/>
+              <w:bottom w:val="single" w:sz="4" w:color="D9D9D9"/>
+              <w:right w:val="single" w:sz="4" w:color="D9D9D9"/>
+              <w:insideH w:val="single" w:sz="4" w:color="D9D9D9"/>
+              <w:insideV w:val="single" w:sz="4" w:color="D9D9D9"/>
+            </w:tcBorders>
+            <w:tcMar>
+              <w:top w:w="70" w:type="dxa"/>
+              <w:start w:w="105" w:type="dxa"/>
+              <w:bottom w:w="70" w:type="dxa"/>
+              <w:end w:w="105" w:type="dxa"/>
+            </w:tcMar>
+            <w:vAlign w:val="center"/>
+          </w:tcPr>
+          <w:p>
+            <w:r>
+              <w:rPr>
+                <w:rFonts w:ascii="Aptos" w:hAnsi="Aptos"/>
+                <w:sz w:val="17"/>
+              </w:rPr>
+              <w:t>Upload a CV/DOCX/PDF, describe the goal in conversation, or import default_config.json for a repeatable no-model setup.</w:t>
+            </w:r>
+          </w:p>
+        </w:tc>
+      </w:tr>
+      <w:tr>
+        <w:trPr>
+          <w:cantSplit/>
+        </w:trPr>
+        <w:tc>
+          <w:tcPr>
+            <w:tcW w:type="dxa" w:w="1944"/>
+            <w:tcBorders>
+              <w:top w:val="single" w:sz="4" w:color="D9D9D9"/>
+              <w:left w:val="single" w:sz="4" w:color="D9D9D9"/>
+              <w:bottom w:val="single" w:sz="4" w:color="D9D9D9"/>
+              <w:right w:val="single" w:sz="4" w:color="D9D9D9"/>
+              <w:insideH w:val="single" w:sz="4" w:color="D9D9D9"/>
+              <w:insideV w:val="single" w:sz="4" w:color="D9D9D9"/>
+            </w:tcBorders>
+            <w:tcMar>
+              <w:top w:w="70" w:type="dxa"/>
+              <w:start w:w="105" w:type="dxa"/>
+              <w:bottom w:w="70" w:type="dxa"/>
+              <w:end w:w="105" w:type="dxa"/>
+            </w:tcMar>
+            <w:shd w:fill="F2F6FA"/>
+            <w:vAlign w:val="center"/>
+          </w:tcPr>
+          <w:p>
+            <w:r>
+              <w:rPr>
+                <w:rFonts w:ascii="Aptos" w:hAnsi="Aptos"/>
+                <w:sz w:val="17"/>
+              </w:rPr>
+              <w:t>Review and privacy</w:t>
+            </w:r>
+          </w:p>
+        </w:tc>
+        <w:tc>
+          <w:tcPr>
+            <w:tcW w:type="dxa" w:w="7848"/>
+            <w:tcBorders>
+              <w:top w:val="single" w:sz="4" w:color="D9D9D9"/>
+              <w:left w:val="single" w:sz="4" w:color="D9D9D9"/>
+              <w:bottom w:val="single" w:sz="4" w:color="D9D9D9"/>
+              <w:right w:val="single" w:sz="4" w:color="D9D9D9"/>
+              <w:insideH w:val="single" w:sz="4" w:color="D9D9D9"/>
+              <w:insideV w:val="single" w:sz="4" w:color="D9D9D9"/>
+            </w:tcBorders>
+            <w:tcMar>
+              <w:top w:w="70" w:type="dxa"/>
+              <w:start w:w="105" w:type="dxa"/>
+              <w:bottom w:w="70" w:type="dxa"/>
+              <w:end w:w="105" w:type="dxa"/>
+            </w:tcMar>
+            <w:shd w:fill="F2F6FA"/>
+            <w:vAlign w:val="center"/>
+          </w:tcPr>
+          <w:p>
+            <w:r>
+              <w:rPr>
+                <w:rFonts w:ascii="Aptos" w:hAnsi="Aptos"/>
+                <w:sz w:val="17"/>
+              </w:rPr>
+              <w:t>Separate facts from suggested wording; include, exclude, revise, or restrict items, with extra safeguards for sensitive details.</w:t>
+            </w:r>
+          </w:p>
+        </w:tc>
+      </w:tr>
+      <w:tr>
+        <w:trPr>
+          <w:cantSplit/>
+        </w:trPr>
+        <w:tc>
+          <w:tcPr>
+            <w:tcW w:type="dxa" w:w="1944"/>
+            <w:tcBorders>
+              <w:top w:val="single" w:sz="4" w:color="D9D9D9"/>
+              <w:left w:val="single" w:sz="4" w:color="D9D9D9"/>
+              <w:bottom w:val="single" w:sz="4" w:color="D9D9D9"/>
+              <w:right w:val="single" w:sz="4" w:color="D9D9D9"/>
+              <w:insideH w:val="single" w:sz="4" w:color="D9D9D9"/>
+              <w:insideV w:val="single" w:sz="4" w:color="D9D9D9"/>
+            </w:tcBorders>
+            <w:tcMar>
+              <w:top w:w="70" w:type="dxa"/>
+              <w:start w:w="105" w:type="dxa"/>
+              <w:bottom w:w="70" w:type="dxa"/>
+              <w:end w:w="105" w:type="dxa"/>
+            </w:tcMar>
+            <w:vAlign w:val="center"/>
+          </w:tcPr>
+          <w:p>
+            <w:r>
+              <w:rPr>
+                <w:rFonts w:ascii="Aptos" w:hAnsi="Aptos"/>
+                <w:sz w:val="17"/>
+              </w:rPr>
+              <w:t>Editable design</w:t>
+            </w:r>
+          </w:p>
+        </w:tc>
+        <w:tc>
+          <w:tcPr>
+            <w:tcW w:type="dxa" w:w="7848"/>
+            <w:tcBorders>
+              <w:top w:val="single" w:sz="4" w:color="D9D9D9"/>
+              <w:left w:val="single" w:sz="4" w:color="D9D9D9"/>
+              <w:bottom w:val="single" w:sz="4" w:color="D9D9D9"/>
+              <w:right w:val="single" w:sz="4" w:color="D9D9D9"/>
+              <w:insideH w:val="single" w:sz="4" w:color="D9D9D9"/>
+              <w:insideV w:val="single" w:sz="4" w:color="D9D9D9"/>
+            </w:tcBorders>
+            <w:tcMar>
+              <w:top w:w="70" w:type="dxa"/>
+              <w:start w:w="105" w:type="dxa"/>
+              <w:bottom w:w="70" w:type="dxa"/>
+              <w:end w:w="105" w:type="dxa"/>
+            </w:tcMar>
+            <w:vAlign w:val="center"/>
+          </w:tcPr>
+          <w:p>
+            <w:r>
+              <w:rPr>
+                <w:rFonts w:ascii="Aptos" w:hAnsi="Aptos"/>
+                <w:sz w:val="17"/>
+              </w:rPr>
+              <w:t>Control audience, purpose, tone, introduction, theme, accent color, typography, and density in a live preview.</w:t>
+            </w:r>
+          </w:p>
+        </w:tc>
+      </w:tr>
+      <w:tr>
+        <w:trPr>
+          <w:cantSplit/>
+        </w:trPr>
+        <w:tc>
+          <w:tcPr>
+            <w:tcW w:type="dxa" w:w="1944"/>
+            <w:tcBorders>
+              <w:top w:val="single" w:sz="4" w:color="D9D9D9"/>
+              <w:left w:val="single" w:sz="4" w:color="D9D9D9"/>
+              <w:bottom w:val="single" w:sz="4" w:color="D9D9D9"/>
+              <w:right w:val="single" w:sz="4" w:color="D9D9D9"/>
+              <w:insideH w:val="single" w:sz="4" w:color="D9D9D9"/>
+              <w:insideV w:val="single" w:sz="4" w:color="D9D9D9"/>
+            </w:tcBorders>
+            <w:tcMar>
+              <w:top w:w="70" w:type="dxa"/>
+              <w:start w:w="105" w:type="dxa"/>
+              <w:bottom w:w="70" w:type="dxa"/>
+              <w:end w:w="105" w:type="dxa"/>
+            </w:tcMar>
+            <w:shd w:fill="F2F6FA"/>
+            <w:vAlign w:val="center"/>
+          </w:tcPr>
+          <w:p>
+            <w:r>
+              <w:rPr>
+                <w:rFonts w:ascii="Aptos" w:hAnsi="Aptos"/>
+                <w:sz w:val="17"/>
+              </w:rPr>
+              <w:t>Model and output</w:t>
+            </w:r>
+          </w:p>
+        </w:tc>
+        <w:tc>
+          <w:tcPr>
+            <w:tcW w:type="dxa" w:w="7848"/>
+            <w:tcBorders>
+              <w:top w:val="single" w:sz="4" w:color="D9D9D9"/>
+              <w:left w:val="single" w:sz="4" w:color="D9D9D9"/>
+              <w:bottom w:val="single" w:sz="4" w:color="D9D9D9"/>
+              <w:right w:val="single" w:sz="4" w:color="D9D9D9"/>
+              <w:insideH w:val="single" w:sz="4" w:color="D9D9D9"/>
+              <w:insideV w:val="single" w:sz="4" w:color="D9D9D9"/>
+            </w:tcBorders>
+            <w:tcMar>
+              <w:top w:w="70" w:type="dxa"/>
+              <w:start w:w="105" w:type="dxa"/>
+              <w:bottom w:w="70" w:type="dxa"/>
+              <w:end w:w="105" w:type="dxa"/>
+            </w:tcMar>
+            <w:shd w:fill="F2F6FA"/>
+            <w:vAlign w:val="center"/>
+          </w:tcPr>
+          <w:p>
+            <w:r>
+              <w:rPr>
+                <w:rFonts w:ascii="Aptos" w:hAnsi="Aptos"/>
+                <w:sz w:val="17"/>
+              </w:rPr>
+              <w:t>Use low-cost DeepSeek Flash by default (or an available OpenAI model) and export the approved result as a one-page PDF.</w:t>
+            </w:r>
+          </w:p>
+        </w:tc>
+      </w:tr>
+    </w:tbl>
     <w:p>
       <w:pPr>
-        <w:pStyle w:val="ListBullet"/>
+        <w:spacing w:after="0"/>
       </w:pPr>
-      <w:r>
-        <w:t>Create an editable one-page profile from user-provided and user-approved information.</w:t>
-      </w:r>
-    </w:p>
-    <w:p>
-      <w:pPr>
-        <w:pStyle w:val="ListBullet"/>
-      </w:pPr>
-      <w:r>
-        <w:t>Keep source evidence distinct from rewritten or suggested wording.</w:t>
-      </w:r>
-    </w:p>
-    <w:p>
-      <w:pPr>
-        <w:pStyle w:val="ListBullet"/>
-      </w:pPr>
-      <w:r>
-        <w:t>Require explicit decisions for sensitive contact information, links, images, logos, and third-party details.</w:t>
-      </w:r>
-    </w:p>
-    <w:p>
-      <w:pPr>
-        <w:pStyle w:val="ListBullet"/>
-      </w:pPr>
-      <w:r>
-        <w:t>Allow the user to control audience, purpose, tone, visual style, typography, color, and information density.</w:t>
-      </w:r>
-    </w:p>
-    <w:p>
-      <w:pPr>
-        <w:pStyle w:val="ListBullet"/>
-      </w:pPr>
-      <w:r>
-        <w:t>Run locally for a reliable classroom demonstration and avoid exposing API keys to the browser.</w:t>
-      </w:r>
-    </w:p>
-    <w:p>
-      <w:pPr>
-        <w:pStyle w:val="ListBullet"/>
-      </w:pPr>
-      <w:r>
-        <w:t>Prefer lower-cost models while retaining selectable higher-capability alternatives.</w:t>
-      </w:r>
     </w:p>
     <w:p>
       <w:r>
@@ -141,7 +448,7 @@
         <w:keepNext/>
       </w:pPr>
       <w:r>
-        <w:t>Current User Experience</w:t>
+        <w:t>Appendix: Classroom Demonstration and Validation</w:t>
       </w:r>
     </w:p>
     <w:p>
@@ -149,7 +456,7 @@
         <w:keepLines/>
       </w:pPr>
       <w:r>
-        <w:t>ProfileKit supports three complementary setup paths. A user can combine them in one session.</w:t>
+        <w:t>Suggested five-minute demonstration:</w:t>
       </w:r>
     </w:p>
     <w:tbl>
@@ -159,2231 +466,9 @@
         <w:tblLook w:firstColumn="1" w:firstRow="1" w:lastColumn="0" w:lastRow="0" w:noHBand="0" w:noVBand="1" w:val="04A0"/>
       </w:tblPr>
       <w:tblGrid>
-        <w:gridCol w:w="3293"/>
-        <w:gridCol w:w="3293"/>
-        <w:gridCol w:w="3293"/>
-      </w:tblGrid>
-      <w:tr>
-        <w:trPr>
-          <w:tblHeader/>
-        </w:trPr>
-        <w:tc>
-          <w:tcPr>
-            <w:tcW w:type="dxa" w:w="1728"/>
-            <w:shd w:fill="1F3A5F"/>
-            <w:tcBorders>
-              <w:top w:val="single" w:sz="4" w:color="D9D9D9"/>
-              <w:left w:val="single" w:sz="4" w:color="D9D9D9"/>
-              <w:bottom w:val="single" w:sz="4" w:color="D9D9D9"/>
-              <w:right w:val="single" w:sz="4" w:color="D9D9D9"/>
-              <w:insideH w:val="single" w:sz="4" w:color="D9D9D9"/>
-              <w:insideV w:val="single" w:sz="4" w:color="D9D9D9"/>
-            </w:tcBorders>
-            <w:tcMar>
-              <w:top w:w="110" w:type="dxa"/>
-              <w:start w:w="120" w:type="dxa"/>
-              <w:bottom w:w="110" w:type="dxa"/>
-              <w:end w:w="120" w:type="dxa"/>
-            </w:tcMar>
-            <w:vAlign w:val="center"/>
-          </w:tcPr>
-          <w:p>
-            <w:pPr>
-              <w:jc w:val="left"/>
-            </w:pPr>
-            <w:r>
-              <w:rPr>
-                <w:rFonts w:ascii="Aptos" w:hAnsi="Aptos"/>
-                <w:b/>
-                <w:color w:val="FFFFFF"/>
-                <w:sz w:val="18"/>
-              </w:rPr>
-              <w:t>Setup path</w:t>
-            </w:r>
-          </w:p>
-        </w:tc>
-        <w:tc>
-          <w:tcPr>
-            <w:tcW w:type="dxa" w:w="4968"/>
-            <w:shd w:fill="1F3A5F"/>
-            <w:tcBorders>
-              <w:top w:val="single" w:sz="4" w:color="D9D9D9"/>
-              <w:left w:val="single" w:sz="4" w:color="D9D9D9"/>
-              <w:bottom w:val="single" w:sz="4" w:color="D9D9D9"/>
-              <w:right w:val="single" w:sz="4" w:color="D9D9D9"/>
-              <w:insideH w:val="single" w:sz="4" w:color="D9D9D9"/>
-              <w:insideV w:val="single" w:sz="4" w:color="D9D9D9"/>
-            </w:tcBorders>
-            <w:tcMar>
-              <w:top w:w="110" w:type="dxa"/>
-              <w:start w:w="120" w:type="dxa"/>
-              <w:bottom w:w="110" w:type="dxa"/>
-              <w:end w:w="120" w:type="dxa"/>
-            </w:tcMar>
-            <w:vAlign w:val="center"/>
-          </w:tcPr>
-          <w:p>
-            <w:pPr>
-              <w:jc w:val="left"/>
-            </w:pPr>
-            <w:r>
-              <w:rPr>
-                <w:rFonts w:ascii="Aptos" w:hAnsi="Aptos"/>
-                <w:b/>
-                <w:color w:val="FFFFFF"/>
-                <w:sz w:val="18"/>
-              </w:rPr>
-              <w:t>How it works</w:t>
-            </w:r>
-          </w:p>
-        </w:tc>
-        <w:tc>
-          <w:tcPr>
-            <w:tcW w:type="dxa" w:w="3096"/>
-            <w:shd w:fill="1F3A5F"/>
-            <w:tcBorders>
-              <w:top w:val="single" w:sz="4" w:color="D9D9D9"/>
-              <w:left w:val="single" w:sz="4" w:color="D9D9D9"/>
-              <w:bottom w:val="single" w:sz="4" w:color="D9D9D9"/>
-              <w:right w:val="single" w:sz="4" w:color="D9D9D9"/>
-              <w:insideH w:val="single" w:sz="4" w:color="D9D9D9"/>
-              <w:insideV w:val="single" w:sz="4" w:color="D9D9D9"/>
-            </w:tcBorders>
-            <w:tcMar>
-              <w:top w:w="110" w:type="dxa"/>
-              <w:start w:w="120" w:type="dxa"/>
-              <w:bottom w:w="110" w:type="dxa"/>
-              <w:end w:w="120" w:type="dxa"/>
-            </w:tcMar>
-            <w:vAlign w:val="center"/>
-          </w:tcPr>
-          <w:p>
-            <w:pPr>
-              <w:jc w:val="left"/>
-            </w:pPr>
-            <w:r>
-              <w:rPr>
-                <w:rFonts w:ascii="Aptos" w:hAnsi="Aptos"/>
-                <w:b/>
-                <w:color w:val="FFFFFF"/>
-                <w:sz w:val="18"/>
-              </w:rPr>
-              <w:t>Best use</w:t>
-            </w:r>
-          </w:p>
-        </w:tc>
-      </w:tr>
-      <w:tr>
-        <w:trPr>
-          <w:cantSplit/>
-        </w:trPr>
-        <w:tc>
-          <w:tcPr>
-            <w:tcW w:type="dxa" w:w="1728"/>
-            <w:tcBorders>
-              <w:top w:val="single" w:sz="4" w:color="D9D9D9"/>
-              <w:left w:val="single" w:sz="4" w:color="D9D9D9"/>
-              <w:bottom w:val="single" w:sz="4" w:color="D9D9D9"/>
-              <w:right w:val="single" w:sz="4" w:color="D9D9D9"/>
-              <w:insideH w:val="single" w:sz="4" w:color="D9D9D9"/>
-              <w:insideV w:val="single" w:sz="4" w:color="D9D9D9"/>
-            </w:tcBorders>
-            <w:tcMar>
-              <w:top w:w="110" w:type="dxa"/>
-              <w:start w:w="120" w:type="dxa"/>
-              <w:bottom w:w="110" w:type="dxa"/>
-              <w:end w:w="120" w:type="dxa"/>
-            </w:tcMar>
-            <w:vAlign w:val="center"/>
-          </w:tcPr>
-          <w:p>
-            <w:r>
-              <w:rPr>
-                <w:rFonts w:ascii="Aptos" w:hAnsi="Aptos"/>
-                <w:sz w:val="18"/>
-              </w:rPr>
-              <w:t>Source upload</w:t>
-            </w:r>
-          </w:p>
-        </w:tc>
-        <w:tc>
-          <w:tcPr>
-            <w:tcW w:type="dxa" w:w="4968"/>
-            <w:tcBorders>
-              <w:top w:val="single" w:sz="4" w:color="D9D9D9"/>
-              <w:left w:val="single" w:sz="4" w:color="D9D9D9"/>
-              <w:bottom w:val="single" w:sz="4" w:color="D9D9D9"/>
-              <w:right w:val="single" w:sz="4" w:color="D9D9D9"/>
-              <w:insideH w:val="single" w:sz="4" w:color="D9D9D9"/>
-              <w:insideV w:val="single" w:sz="4" w:color="D9D9D9"/>
-            </w:tcBorders>
-            <w:tcMar>
-              <w:top w:w="110" w:type="dxa"/>
-              <w:start w:w="120" w:type="dxa"/>
-              <w:bottom w:w="110" w:type="dxa"/>
-              <w:end w:w="120" w:type="dxa"/>
-            </w:tcMar>
-            <w:vAlign w:val="center"/>
-          </w:tcPr>
-          <w:p>
-            <w:r>
-              <w:rPr>
-                <w:rFonts w:ascii="Aptos" w:hAnsi="Aptos"/>
-                <w:sz w:val="18"/>
-              </w:rPr>
-              <w:t>Upload a resume or personal-information DOCX, PDF, text file, or image. Extracted text enters agent review.</w:t>
-            </w:r>
-          </w:p>
-        </w:tc>
-        <w:tc>
-          <w:tcPr>
-            <w:tcW w:type="dxa" w:w="3096"/>
-            <w:tcBorders>
-              <w:top w:val="single" w:sz="4" w:color="D9D9D9"/>
-              <w:left w:val="single" w:sz="4" w:color="D9D9D9"/>
-              <w:bottom w:val="single" w:sz="4" w:color="D9D9D9"/>
-              <w:right w:val="single" w:sz="4" w:color="D9D9D9"/>
-              <w:insideH w:val="single" w:sz="4" w:color="D9D9D9"/>
-              <w:insideV w:val="single" w:sz="4" w:color="D9D9D9"/>
-            </w:tcBorders>
-            <w:tcMar>
-              <w:top w:w="110" w:type="dxa"/>
-              <w:start w:w="120" w:type="dxa"/>
-              <w:bottom w:w="110" w:type="dxa"/>
-              <w:end w:w="120" w:type="dxa"/>
-            </w:tcMar>
-            <w:vAlign w:val="center"/>
-          </w:tcPr>
-          <w:p>
-            <w:r>
-              <w:rPr>
-                <w:rFonts w:ascii="Aptos" w:hAnsi="Aptos"/>
-                <w:sz w:val="18"/>
-              </w:rPr>
-              <w:t>Evidence-based generation from existing material</w:t>
-            </w:r>
-          </w:p>
-        </w:tc>
-      </w:tr>
-      <w:tr>
-        <w:trPr>
-          <w:cantSplit/>
-        </w:trPr>
-        <w:tc>
-          <w:tcPr>
-            <w:tcW w:type="dxa" w:w="1728"/>
-            <w:tcBorders>
-              <w:top w:val="single" w:sz="4" w:color="D9D9D9"/>
-              <w:left w:val="single" w:sz="4" w:color="D9D9D9"/>
-              <w:bottom w:val="single" w:sz="4" w:color="D9D9D9"/>
-              <w:right w:val="single" w:sz="4" w:color="D9D9D9"/>
-              <w:insideH w:val="single" w:sz="4" w:color="D9D9D9"/>
-              <w:insideV w:val="single" w:sz="4" w:color="D9D9D9"/>
-            </w:tcBorders>
-            <w:tcMar>
-              <w:top w:w="110" w:type="dxa"/>
-              <w:start w:w="120" w:type="dxa"/>
-              <w:bottom w:w="110" w:type="dxa"/>
-              <w:end w:w="120" w:type="dxa"/>
-            </w:tcMar>
-            <w:shd w:fill="F2F6FA"/>
-            <w:vAlign w:val="center"/>
-          </w:tcPr>
-          <w:p>
-            <w:r>
-              <w:rPr>
-                <w:rFonts w:ascii="Aptos" w:hAnsi="Aptos"/>
-                <w:sz w:val="18"/>
-              </w:rPr>
-              <w:t>Conversation</w:t>
-            </w:r>
-          </w:p>
-        </w:tc>
-        <w:tc>
-          <w:tcPr>
-            <w:tcW w:type="dxa" w:w="4968"/>
-            <w:tcBorders>
-              <w:top w:val="single" w:sz="4" w:color="D9D9D9"/>
-              <w:left w:val="single" w:sz="4" w:color="D9D9D9"/>
-              <w:bottom w:val="single" w:sz="4" w:color="D9D9D9"/>
-              <w:right w:val="single" w:sz="4" w:color="D9D9D9"/>
-              <w:insideH w:val="single" w:sz="4" w:color="D9D9D9"/>
-              <w:insideV w:val="single" w:sz="4" w:color="D9D9D9"/>
-            </w:tcBorders>
-            <w:tcMar>
-              <w:top w:w="110" w:type="dxa"/>
-              <w:start w:w="120" w:type="dxa"/>
-              <w:bottom w:w="110" w:type="dxa"/>
-              <w:end w:w="120" w:type="dxa"/>
-            </w:tcMar>
-            <w:shd w:fill="F2F6FA"/>
-            <w:vAlign w:val="center"/>
-          </w:tcPr>
-          <w:p>
-            <w:r>
-              <w:rPr>
-                <w:rFonts w:ascii="Aptos" w:hAnsi="Aptos"/>
-                <w:sz w:val="18"/>
-              </w:rPr>
-              <w:t>Describe the audience, occasion, purpose, restrictions, and requested output in natural language.</w:t>
-            </w:r>
-          </w:p>
-        </w:tc>
-        <w:tc>
-          <w:tcPr>
-            <w:tcW w:type="dxa" w:w="3096"/>
-            <w:tcBorders>
-              <w:top w:val="single" w:sz="4" w:color="D9D9D9"/>
-              <w:left w:val="single" w:sz="4" w:color="D9D9D9"/>
-              <w:bottom w:val="single" w:sz="4" w:color="D9D9D9"/>
-              <w:right w:val="single" w:sz="4" w:color="D9D9D9"/>
-              <w:insideH w:val="single" w:sz="4" w:color="D9D9D9"/>
-              <w:insideV w:val="single" w:sz="4" w:color="D9D9D9"/>
-            </w:tcBorders>
-            <w:tcMar>
-              <w:top w:w="110" w:type="dxa"/>
-              <w:start w:w="120" w:type="dxa"/>
-              <w:bottom w:w="110" w:type="dxa"/>
-              <w:end w:w="120" w:type="dxa"/>
-            </w:tcMar>
-            <w:shd w:fill="F2F6FA"/>
-            <w:vAlign w:val="center"/>
-          </w:tcPr>
-          <w:p>
-            <w:r>
-              <w:rPr>
-                <w:rFonts w:ascii="Aptos" w:hAnsi="Aptos"/>
-                <w:sz w:val="18"/>
-              </w:rPr>
-              <w:t>Iterative clarification and wording refinement</w:t>
-            </w:r>
-          </w:p>
-        </w:tc>
-      </w:tr>
-      <w:tr>
-        <w:trPr>
-          <w:cantSplit/>
-        </w:trPr>
-        <w:tc>
-          <w:tcPr>
-            <w:tcW w:type="dxa" w:w="1728"/>
-            <w:tcBorders>
-              <w:top w:val="single" w:sz="4" w:color="D9D9D9"/>
-              <w:left w:val="single" w:sz="4" w:color="D9D9D9"/>
-              <w:bottom w:val="single" w:sz="4" w:color="D9D9D9"/>
-              <w:right w:val="single" w:sz="4" w:color="D9D9D9"/>
-              <w:insideH w:val="single" w:sz="4" w:color="D9D9D9"/>
-              <w:insideV w:val="single" w:sz="4" w:color="D9D9D9"/>
-            </w:tcBorders>
-            <w:tcMar>
-              <w:top w:w="110" w:type="dxa"/>
-              <w:start w:w="120" w:type="dxa"/>
-              <w:bottom w:w="110" w:type="dxa"/>
-              <w:end w:w="120" w:type="dxa"/>
-            </w:tcMar>
-            <w:vAlign w:val="center"/>
-          </w:tcPr>
-          <w:p>
-            <w:r>
-              <w:rPr>
-                <w:rFonts w:ascii="Aptos" w:hAnsi="Aptos"/>
-                <w:sz w:val="18"/>
-              </w:rPr>
-              <w:t>Configuration</w:t>
-            </w:r>
-          </w:p>
-        </w:tc>
-        <w:tc>
-          <w:tcPr>
-            <w:tcW w:type="dxa" w:w="4968"/>
-            <w:tcBorders>
-              <w:top w:val="single" w:sz="4" w:color="D9D9D9"/>
-              <w:left w:val="single" w:sz="4" w:color="D9D9D9"/>
-              <w:bottom w:val="single" w:sz="4" w:color="D9D9D9"/>
-              <w:right w:val="single" w:sz="4" w:color="D9D9D9"/>
-              <w:insideH w:val="single" w:sz="4" w:color="D9D9D9"/>
-              <w:insideV w:val="single" w:sz="4" w:color="D9D9D9"/>
-            </w:tcBorders>
-            <w:tcMar>
-              <w:top w:w="110" w:type="dxa"/>
-              <w:start w:w="120" w:type="dxa"/>
-              <w:bottom w:w="110" w:type="dxa"/>
-              <w:end w:w="120" w:type="dxa"/>
-            </w:tcMar>
-            <w:vAlign w:val="center"/>
-          </w:tcPr>
-          <w:p>
-            <w:r>
-              <w:rPr>
-                <w:rFonts w:ascii="Aptos" w:hAnsi="Aptos"/>
-                <w:sz w:val="18"/>
-              </w:rPr>
-              <w:t>Edit and upload default_config.json for deterministic profile and design setup without a model call.</w:t>
-            </w:r>
-          </w:p>
-        </w:tc>
-        <w:tc>
-          <w:tcPr>
-            <w:tcW w:type="dxa" w:w="3096"/>
-            <w:tcBorders>
-              <w:top w:val="single" w:sz="4" w:color="D9D9D9"/>
-              <w:left w:val="single" w:sz="4" w:color="D9D9D9"/>
-              <w:bottom w:val="single" w:sz="4" w:color="D9D9D9"/>
-              <w:right w:val="single" w:sz="4" w:color="D9D9D9"/>
-              <w:insideH w:val="single" w:sz="4" w:color="D9D9D9"/>
-              <w:insideV w:val="single" w:sz="4" w:color="D9D9D9"/>
-            </w:tcBorders>
-            <w:tcMar>
-              <w:top w:w="110" w:type="dxa"/>
-              <w:start w:w="120" w:type="dxa"/>
-              <w:bottom w:w="110" w:type="dxa"/>
-              <w:end w:w="120" w:type="dxa"/>
-            </w:tcMar>
-            <w:vAlign w:val="center"/>
-          </w:tcPr>
-          <w:p>
-            <w:r>
-              <w:rPr>
-                <w:rFonts w:ascii="Aptos" w:hAnsi="Aptos"/>
-                <w:sz w:val="18"/>
-              </w:rPr>
-              <w:t>Fast classroom setup and repeatable demonstrations</w:t>
-            </w:r>
-          </w:p>
-        </w:tc>
-      </w:tr>
-      <w:tr>
-        <w:trPr>
-          <w:cantSplit/>
-        </w:trPr>
-        <w:tc>
-          <w:tcPr>
-            <w:tcW w:type="dxa" w:w="1728"/>
-            <w:tcBorders>
-              <w:top w:val="single" w:sz="4" w:color="D9D9D9"/>
-              <w:left w:val="single" w:sz="4" w:color="D9D9D9"/>
-              <w:bottom w:val="single" w:sz="4" w:color="D9D9D9"/>
-              <w:right w:val="single" w:sz="4" w:color="D9D9D9"/>
-              <w:insideH w:val="single" w:sz="4" w:color="D9D9D9"/>
-              <w:insideV w:val="single" w:sz="4" w:color="D9D9D9"/>
-            </w:tcBorders>
-            <w:tcMar>
-              <w:top w:w="110" w:type="dxa"/>
-              <w:start w:w="120" w:type="dxa"/>
-              <w:bottom w:w="110" w:type="dxa"/>
-              <w:end w:w="120" w:type="dxa"/>
-            </w:tcMar>
-            <w:shd w:fill="F2F6FA"/>
-            <w:vAlign w:val="center"/>
-          </w:tcPr>
-          <w:p>
-            <w:r>
-              <w:rPr>
-                <w:rFonts w:ascii="Aptos" w:hAnsi="Aptos"/>
-                <w:sz w:val="18"/>
-              </w:rPr>
-              <w:t>Customization panel</w:t>
-            </w:r>
-          </w:p>
-        </w:tc>
-        <w:tc>
-          <w:tcPr>
-            <w:tcW w:type="dxa" w:w="4968"/>
-            <w:tcBorders>
-              <w:top w:val="single" w:sz="4" w:color="D9D9D9"/>
-              <w:left w:val="single" w:sz="4" w:color="D9D9D9"/>
-              <w:bottom w:val="single" w:sz="4" w:color="D9D9D9"/>
-              <w:right w:val="single" w:sz="4" w:color="D9D9D9"/>
-              <w:insideH w:val="single" w:sz="4" w:color="D9D9D9"/>
-              <w:insideV w:val="single" w:sz="4" w:color="D9D9D9"/>
-            </w:tcBorders>
-            <w:tcMar>
-              <w:top w:w="110" w:type="dxa"/>
-              <w:start w:w="120" w:type="dxa"/>
-              <w:bottom w:w="110" w:type="dxa"/>
-              <w:end w:w="120" w:type="dxa"/>
-            </w:tcMar>
-            <w:shd w:fill="F2F6FA"/>
-            <w:vAlign w:val="center"/>
-          </w:tcPr>
-          <w:p>
-            <w:r>
-              <w:rPr>
-                <w:rFonts w:ascii="Aptos" w:hAnsi="Aptos"/>
-                <w:sz w:val="18"/>
-              </w:rPr>
-              <w:t>Edit core profile content and visual preferences directly in the browser.</w:t>
-            </w:r>
-          </w:p>
-        </w:tc>
-        <w:tc>
-          <w:tcPr>
-            <w:tcW w:type="dxa" w:w="3096"/>
-            <w:tcBorders>
-              <w:top w:val="single" w:sz="4" w:color="D9D9D9"/>
-              <w:left w:val="single" w:sz="4" w:color="D9D9D9"/>
-              <w:bottom w:val="single" w:sz="4" w:color="D9D9D9"/>
-              <w:right w:val="single" w:sz="4" w:color="D9D9D9"/>
-              <w:insideH w:val="single" w:sz="4" w:color="D9D9D9"/>
-              <w:insideV w:val="single" w:sz="4" w:color="D9D9D9"/>
-            </w:tcBorders>
-            <w:tcMar>
-              <w:top w:w="110" w:type="dxa"/>
-              <w:start w:w="120" w:type="dxa"/>
-              <w:bottom w:w="110" w:type="dxa"/>
-              <w:end w:w="120" w:type="dxa"/>
-            </w:tcMar>
-            <w:shd w:fill="F2F6FA"/>
-            <w:vAlign w:val="center"/>
-          </w:tcPr>
-          <w:p>
-            <w:r>
-              <w:rPr>
-                <w:rFonts w:ascii="Aptos" w:hAnsi="Aptos"/>
-                <w:sz w:val="18"/>
-              </w:rPr>
-              <w:t>Fine control over the live page and exported PDF</w:t>
-            </w:r>
-          </w:p>
-        </w:tc>
-      </w:tr>
-    </w:tbl>
-    <w:p>
-      <w:pPr>
-        <w:spacing w:after="0"/>
-      </w:pPr>
-    </w:p>
-    <w:p>
-      <w:pPr>
-        <w:pStyle w:val="Heading1"/>
-        <w:keepNext/>
-      </w:pPr>
-      <w:r>
-        <w:t>Workflow and Agent Behavior</w:t>
-      </w:r>
-    </w:p>
-    <w:p>
-      <w:pPr>
-        <w:keepLines/>
-      </w:pPr>
-      <w:r>
-        <w:t>The agent follows an explicit eleven-stage workflow: Intake, Source Review, Personal Profile Record, Privacy and Authorization Review, User Content Approval, Format Recommendation, Visual Direction Choice, Draft, Final Review, User Approval, and Editable Output. A controller prevents skipped approval gates and can return the session to an earlier stage when the user revises information.</w:t>
-      </w:r>
-    </w:p>
-    <w:p>
-      <w:pPr>
-        <w:keepLines/>
-      </w:pPr>
-      <w:r>
-        <w:t>At each stage, the model receives the current profile record, recent conversation, current stage, and saved design preferences. It must distinguish confirmed facts, suggested wording, unresolved claims, and unsupported content. The runtime also blocks unsafe transitions, such as drafting with unresolved source conflicts or unauthorized links and images.</w:t>
-      </w:r>
-    </w:p>
-    <w:p>
-      <w:pPr>
-        <w:pStyle w:val="Heading1"/>
-        <w:keepNext/>
-      </w:pPr>
-      <w:r>
-        <w:t>Privacy and User Control</w:t>
-      </w:r>
-    </w:p>
-    <w:p>
-      <w:pPr>
-        <w:pStyle w:val="ListBullet"/>
-      </w:pPr>
-      <w:r>
-        <w:t>The local .env file stores API keys and is excluded from Git.</w:t>
-      </w:r>
-    </w:p>
-    <w:p>
-      <w:pPr>
-        <w:pStyle w:val="ListBullet"/>
-      </w:pPr>
-      <w:r>
-        <w:t>API keys remain server-side and are never included in browser state.</w:t>
-      </w:r>
-    </w:p>
-    <w:p>
-      <w:pPr>
-        <w:pStyle w:val="ListBullet"/>
-      </w:pPr>
-      <w:r>
-        <w:t>Home addresses are prohibited from public output, and phone numbers are excluded by default.</w:t>
-      </w:r>
-    </w:p>
-    <w:p>
-      <w:pPr>
-        <w:pStyle w:val="ListBullet"/>
-      </w:pPr>
-      <w:r>
-        <w:t>Unconfirmed sensitive items do not appear in the live page or PDF.</w:t>
-      </w:r>
-    </w:p>
-    <w:p>
-      <w:pPr>
-        <w:pStyle w:val="ListBullet"/>
-      </w:pPr>
-      <w:r>
-        <w:t>Each profile item can be included, excluded, revised, or restricted independently.</w:t>
-      </w:r>
-    </w:p>
-    <w:p>
-      <w:pPr>
-        <w:pStyle w:val="ListBullet"/>
-      </w:pPr>
-      <w:r>
-        <w:t>Uploaded images and links are not treated as publicly authorized merely because they were supplied.</w:t>
-      </w:r>
-    </w:p>
-    <w:p>
-      <w:pPr>
-        <w:pStyle w:val="ListBullet"/>
-      </w:pPr>
-      <w:r>
-        <w:t>The session is stored locally with user-only file permissions and is ignored by Git.</w:t>
-      </w:r>
-    </w:p>
-    <w:p>
-      <w:pPr>
-        <w:pStyle w:val="Heading1"/>
-        <w:keepNext/>
-      </w:pPr>
-      <w:r>
-        <w:t>Model Strategy</w:t>
-      </w:r>
-    </w:p>
-    <w:p>
-      <w:pPr>
-        <w:keepLines/>
-      </w:pPr>
-      <w:r>
-        <w:t>DeepSeek Flash is the default model because it provides a lower-cost route for classroom use. OpenAI GPT-6 Luna is the preferred OpenAI alternative, with GPT-6 Sol and GPT-6 Astra available when a user deliberately chooses a higher-cost option. The interface shows the relative cost tier and disables choices whose API keys are unavailable. Gemini is currently covered by the API-key diagnostic but is not yet a conversation provider in the web interface.</w:t>
-      </w:r>
-    </w:p>
-    <w:p>
-      <w:pPr>
-        <w:pStyle w:val="Heading1"/>
-        <w:keepNext/>
-      </w:pPr>
-      <w:r>
-        <w:t>Visual Output and Customization</w:t>
-      </w:r>
-    </w:p>
-    <w:p>
-      <w:pPr>
-        <w:keepLines/>
-      </w:pPr>
-      <w:r>
-        <w:t>The right side of the workspace switches between the reviewable record and a live US Letter preview. Academic, Modern, and Minimal templates are available. The user can also choose a custom accent color, serif, sans-serif, or hybrid typography, and compact, balanced, or airy density. The PDF generator uses the same saved profile and design preferences as the browser preview, reducing mismatch between what the user sees and what is exported.</w:t>
-      </w:r>
-    </w:p>
-    <w:p>
-      <w:pPr>
-        <w:pStyle w:val="Heading1"/>
-        <w:keepNext/>
-      </w:pPr>
-      <w:r>
-        <w:t>Implementation Architecture</w:t>
-      </w:r>
-    </w:p>
-    <w:tbl>
-      <w:tblPr>
-        <w:tblW w:type="auto" w:w="0"/>
-        <w:tblLayout w:type="fixed"/>
-        <w:tblLook w:firstColumn="1" w:firstRow="1" w:lastColumn="0" w:lastRow="0" w:noHBand="0" w:noVBand="1" w:val="04A0"/>
-      </w:tblPr>
-      <w:tblGrid>
-        <w:gridCol w:w="3293"/>
-        <w:gridCol w:w="3293"/>
-        <w:gridCol w:w="3293"/>
-      </w:tblGrid>
-      <w:tr>
-        <w:trPr>
-          <w:tblHeader/>
-        </w:trPr>
-        <w:tc>
-          <w:tcPr>
-            <w:tcW w:type="dxa" w:w="1656"/>
-            <w:shd w:fill="1F3A5F"/>
-            <w:tcBorders>
-              <w:top w:val="single" w:sz="4" w:color="D9D9D9"/>
-              <w:left w:val="single" w:sz="4" w:color="D9D9D9"/>
-              <w:bottom w:val="single" w:sz="4" w:color="D9D9D9"/>
-              <w:right w:val="single" w:sz="4" w:color="D9D9D9"/>
-              <w:insideH w:val="single" w:sz="4" w:color="D9D9D9"/>
-              <w:insideV w:val="single" w:sz="4" w:color="D9D9D9"/>
-            </w:tcBorders>
-            <w:tcMar>
-              <w:top w:w="110" w:type="dxa"/>
-              <w:start w:w="120" w:type="dxa"/>
-              <w:bottom w:w="110" w:type="dxa"/>
-              <w:end w:w="120" w:type="dxa"/>
-            </w:tcMar>
-            <w:vAlign w:val="center"/>
-          </w:tcPr>
-          <w:p>
-            <w:pPr>
-              <w:jc w:val="left"/>
-            </w:pPr>
-            <w:r>
-              <w:rPr>
-                <w:rFonts w:ascii="Aptos" w:hAnsi="Aptos"/>
-                <w:b/>
-                <w:color w:val="FFFFFF"/>
-                <w:sz w:val="18"/>
-              </w:rPr>
-              <w:t>Layer</w:t>
-            </w:r>
-          </w:p>
-        </w:tc>
-        <w:tc>
-          <w:tcPr>
-            <w:tcW w:type="dxa" w:w="5400"/>
-            <w:shd w:fill="1F3A5F"/>
-            <w:tcBorders>
-              <w:top w:val="single" w:sz="4" w:color="D9D9D9"/>
-              <w:left w:val="single" w:sz="4" w:color="D9D9D9"/>
-              <w:bottom w:val="single" w:sz="4" w:color="D9D9D9"/>
-              <w:right w:val="single" w:sz="4" w:color="D9D9D9"/>
-              <w:insideH w:val="single" w:sz="4" w:color="D9D9D9"/>
-              <w:insideV w:val="single" w:sz="4" w:color="D9D9D9"/>
-            </w:tcBorders>
-            <w:tcMar>
-              <w:top w:w="110" w:type="dxa"/>
-              <w:start w:w="120" w:type="dxa"/>
-              <w:bottom w:w="110" w:type="dxa"/>
-              <w:end w:w="120" w:type="dxa"/>
-            </w:tcMar>
-            <w:vAlign w:val="center"/>
-          </w:tcPr>
-          <w:p>
-            <w:pPr>
-              <w:jc w:val="left"/>
-            </w:pPr>
-            <w:r>
-              <w:rPr>
-                <w:rFonts w:ascii="Aptos" w:hAnsi="Aptos"/>
-                <w:b/>
-                <w:color w:val="FFFFFF"/>
-                <w:sz w:val="18"/>
-              </w:rPr>
-              <w:t>Responsibility</w:t>
-            </w:r>
-          </w:p>
-        </w:tc>
-        <w:tc>
-          <w:tcPr>
-            <w:tcW w:type="dxa" w:w="2736"/>
-            <w:shd w:fill="1F3A5F"/>
-            <w:tcBorders>
-              <w:top w:val="single" w:sz="4" w:color="D9D9D9"/>
-              <w:left w:val="single" w:sz="4" w:color="D9D9D9"/>
-              <w:bottom w:val="single" w:sz="4" w:color="D9D9D9"/>
-              <w:right w:val="single" w:sz="4" w:color="D9D9D9"/>
-              <w:insideH w:val="single" w:sz="4" w:color="D9D9D9"/>
-              <w:insideV w:val="single" w:sz="4" w:color="D9D9D9"/>
-            </w:tcBorders>
-            <w:tcMar>
-              <w:top w:w="110" w:type="dxa"/>
-              <w:start w:w="120" w:type="dxa"/>
-              <w:bottom w:w="110" w:type="dxa"/>
-              <w:end w:w="120" w:type="dxa"/>
-            </w:tcMar>
-            <w:vAlign w:val="center"/>
-          </w:tcPr>
-          <w:p>
-            <w:pPr>
-              <w:jc w:val="left"/>
-            </w:pPr>
-            <w:r>
-              <w:rPr>
-                <w:rFonts w:ascii="Aptos" w:hAnsi="Aptos"/>
-                <w:b/>
-                <w:color w:val="FFFFFF"/>
-                <w:sz w:val="18"/>
-              </w:rPr>
-              <w:t>Key technology</w:t>
-            </w:r>
-          </w:p>
-        </w:tc>
-      </w:tr>
-      <w:tr>
-        <w:trPr>
-          <w:cantSplit/>
-        </w:trPr>
-        <w:tc>
-          <w:tcPr>
-            <w:tcW w:type="dxa" w:w="1656"/>
-            <w:tcBorders>
-              <w:top w:val="single" w:sz="4" w:color="D9D9D9"/>
-              <w:left w:val="single" w:sz="4" w:color="D9D9D9"/>
-              <w:bottom w:val="single" w:sz="4" w:color="D9D9D9"/>
-              <w:right w:val="single" w:sz="4" w:color="D9D9D9"/>
-              <w:insideH w:val="single" w:sz="4" w:color="D9D9D9"/>
-              <w:insideV w:val="single" w:sz="4" w:color="D9D9D9"/>
-            </w:tcBorders>
-            <w:tcMar>
-              <w:top w:w="110" w:type="dxa"/>
-              <w:start w:w="120" w:type="dxa"/>
-              <w:bottom w:w="110" w:type="dxa"/>
-              <w:end w:w="120" w:type="dxa"/>
-            </w:tcMar>
-            <w:vAlign w:val="center"/>
-          </w:tcPr>
-          <w:p>
-            <w:r>
-              <w:rPr>
-                <w:rFonts w:ascii="Aptos" w:hAnsi="Aptos"/>
-                <w:sz w:val="18"/>
-              </w:rPr>
-              <w:t>Web interface</w:t>
-            </w:r>
-          </w:p>
-        </w:tc>
-        <w:tc>
-          <w:tcPr>
-            <w:tcW w:type="dxa" w:w="5400"/>
-            <w:tcBorders>
-              <w:top w:val="single" w:sz="4" w:color="D9D9D9"/>
-              <w:left w:val="single" w:sz="4" w:color="D9D9D9"/>
-              <w:bottom w:val="single" w:sz="4" w:color="D9D9D9"/>
-              <w:right w:val="single" w:sz="4" w:color="D9D9D9"/>
-              <w:insideH w:val="single" w:sz="4" w:color="D9D9D9"/>
-              <w:insideV w:val="single" w:sz="4" w:color="D9D9D9"/>
-            </w:tcBorders>
-            <w:tcMar>
-              <w:top w:w="110" w:type="dxa"/>
-              <w:start w:w="120" w:type="dxa"/>
-              <w:bottom w:w="110" w:type="dxa"/>
-              <w:end w:w="120" w:type="dxa"/>
-            </w:tcMar>
-            <w:vAlign w:val="center"/>
-          </w:tcPr>
-          <w:p>
-            <w:r>
-              <w:rPr>
-                <w:rFonts w:ascii="Aptos" w:hAnsi="Aptos"/>
-                <w:sz w:val="18"/>
-              </w:rPr>
-              <w:t>Uploads, conversation, item decisions, customization, live preview, and export controls</w:t>
-            </w:r>
-          </w:p>
-        </w:tc>
-        <w:tc>
-          <w:tcPr>
-            <w:tcW w:type="dxa" w:w="2736"/>
-            <w:tcBorders>
-              <w:top w:val="single" w:sz="4" w:color="D9D9D9"/>
-              <w:left w:val="single" w:sz="4" w:color="D9D9D9"/>
-              <w:bottom w:val="single" w:sz="4" w:color="D9D9D9"/>
-              <w:right w:val="single" w:sz="4" w:color="D9D9D9"/>
-              <w:insideH w:val="single" w:sz="4" w:color="D9D9D9"/>
-              <w:insideV w:val="single" w:sz="4" w:color="D9D9D9"/>
-            </w:tcBorders>
-            <w:tcMar>
-              <w:top w:w="110" w:type="dxa"/>
-              <w:start w:w="120" w:type="dxa"/>
-              <w:bottom w:w="110" w:type="dxa"/>
-              <w:end w:w="120" w:type="dxa"/>
-            </w:tcMar>
-            <w:vAlign w:val="center"/>
-          </w:tcPr>
-          <w:p>
-            <w:r>
-              <w:rPr>
-                <w:rFonts w:ascii="Aptos" w:hAnsi="Aptos"/>
-                <w:sz w:val="18"/>
-              </w:rPr>
-              <w:t>HTML, CSS, JavaScript</w:t>
-            </w:r>
-          </w:p>
-        </w:tc>
-      </w:tr>
-      <w:tr>
-        <w:trPr>
-          <w:cantSplit/>
-        </w:trPr>
-        <w:tc>
-          <w:tcPr>
-            <w:tcW w:type="dxa" w:w="1656"/>
-            <w:tcBorders>
-              <w:top w:val="single" w:sz="4" w:color="D9D9D9"/>
-              <w:left w:val="single" w:sz="4" w:color="D9D9D9"/>
-              <w:bottom w:val="single" w:sz="4" w:color="D9D9D9"/>
-              <w:right w:val="single" w:sz="4" w:color="D9D9D9"/>
-              <w:insideH w:val="single" w:sz="4" w:color="D9D9D9"/>
-              <w:insideV w:val="single" w:sz="4" w:color="D9D9D9"/>
-            </w:tcBorders>
-            <w:tcMar>
-              <w:top w:w="110" w:type="dxa"/>
-              <w:start w:w="120" w:type="dxa"/>
-              <w:bottom w:w="110" w:type="dxa"/>
-              <w:end w:w="120" w:type="dxa"/>
-            </w:tcMar>
-            <w:shd w:fill="F2F6FA"/>
-            <w:vAlign w:val="center"/>
-          </w:tcPr>
-          <w:p>
-            <w:r>
-              <w:rPr>
-                <w:rFonts w:ascii="Aptos" w:hAnsi="Aptos"/>
-                <w:sz w:val="18"/>
-              </w:rPr>
-              <w:t>Local API</w:t>
-            </w:r>
-          </w:p>
-        </w:tc>
-        <w:tc>
-          <w:tcPr>
-            <w:tcW w:type="dxa" w:w="5400"/>
-            <w:tcBorders>
-              <w:top w:val="single" w:sz="4" w:color="D9D9D9"/>
-              <w:left w:val="single" w:sz="4" w:color="D9D9D9"/>
-              <w:bottom w:val="single" w:sz="4" w:color="D9D9D9"/>
-              <w:right w:val="single" w:sz="4" w:color="D9D9D9"/>
-              <w:insideH w:val="single" w:sz="4" w:color="D9D9D9"/>
-              <w:insideV w:val="single" w:sz="4" w:color="D9D9D9"/>
-            </w:tcBorders>
-            <w:tcMar>
-              <w:top w:w="110" w:type="dxa"/>
-              <w:start w:w="120" w:type="dxa"/>
-              <w:bottom w:w="110" w:type="dxa"/>
-              <w:end w:w="120" w:type="dxa"/>
-            </w:tcMar>
-            <w:shd w:fill="F2F6FA"/>
-            <w:vAlign w:val="center"/>
-          </w:tcPr>
-          <w:p>
-            <w:r>
-              <w:rPr>
-                <w:rFonts w:ascii="Aptos" w:hAnsi="Aptos"/>
-                <w:sz w:val="18"/>
-              </w:rPr>
-              <w:t>Session state, file limits, validation, model routing, configuration import, and exports</w:t>
-            </w:r>
-          </w:p>
-        </w:tc>
-        <w:tc>
-          <w:tcPr>
-            <w:tcW w:type="dxa" w:w="2736"/>
-            <w:tcBorders>
-              <w:top w:val="single" w:sz="4" w:color="D9D9D9"/>
-              <w:left w:val="single" w:sz="4" w:color="D9D9D9"/>
-              <w:bottom w:val="single" w:sz="4" w:color="D9D9D9"/>
-              <w:right w:val="single" w:sz="4" w:color="D9D9D9"/>
-              <w:insideH w:val="single" w:sz="4" w:color="D9D9D9"/>
-              <w:insideV w:val="single" w:sz="4" w:color="D9D9D9"/>
-            </w:tcBorders>
-            <w:tcMar>
-              <w:top w:w="110" w:type="dxa"/>
-              <w:start w:w="120" w:type="dxa"/>
-              <w:bottom w:w="110" w:type="dxa"/>
-              <w:end w:w="120" w:type="dxa"/>
-            </w:tcMar>
-            <w:shd w:fill="F2F6FA"/>
-            <w:vAlign w:val="center"/>
-          </w:tcPr>
-          <w:p>
-            <w:r>
-              <w:rPr>
-                <w:rFonts w:ascii="Aptos" w:hAnsi="Aptos"/>
-                <w:sz w:val="18"/>
-              </w:rPr>
-              <w:t>FastAPI and Pydantic</w:t>
-            </w:r>
-          </w:p>
-        </w:tc>
-      </w:tr>
-      <w:tr>
-        <w:trPr>
-          <w:cantSplit/>
-        </w:trPr>
-        <w:tc>
-          <w:tcPr>
-            <w:tcW w:type="dxa" w:w="1656"/>
-            <w:tcBorders>
-              <w:top w:val="single" w:sz="4" w:color="D9D9D9"/>
-              <w:left w:val="single" w:sz="4" w:color="D9D9D9"/>
-              <w:bottom w:val="single" w:sz="4" w:color="D9D9D9"/>
-              <w:right w:val="single" w:sz="4" w:color="D9D9D9"/>
-              <w:insideH w:val="single" w:sz="4" w:color="D9D9D9"/>
-              <w:insideV w:val="single" w:sz="4" w:color="D9D9D9"/>
-            </w:tcBorders>
-            <w:tcMar>
-              <w:top w:w="110" w:type="dxa"/>
-              <w:start w:w="120" w:type="dxa"/>
-              <w:bottom w:w="110" w:type="dxa"/>
-              <w:end w:w="120" w:type="dxa"/>
-            </w:tcMar>
-            <w:vAlign w:val="center"/>
-          </w:tcPr>
-          <w:p>
-            <w:r>
-              <w:rPr>
-                <w:rFonts w:ascii="Aptos" w:hAnsi="Aptos"/>
-                <w:sz w:val="18"/>
-              </w:rPr>
-              <w:t>Agent layer</w:t>
-            </w:r>
-          </w:p>
-        </w:tc>
-        <w:tc>
-          <w:tcPr>
-            <w:tcW w:type="dxa" w:w="5400"/>
-            <w:tcBorders>
-              <w:top w:val="single" w:sz="4" w:color="D9D9D9"/>
-              <w:left w:val="single" w:sz="4" w:color="D9D9D9"/>
-              <w:bottom w:val="single" w:sz="4" w:color="D9D9D9"/>
-              <w:right w:val="single" w:sz="4" w:color="D9D9D9"/>
-              <w:insideH w:val="single" w:sz="4" w:color="D9D9D9"/>
-              <w:insideV w:val="single" w:sz="4" w:color="D9D9D9"/>
-            </w:tcBorders>
-            <w:tcMar>
-              <w:top w:w="110" w:type="dxa"/>
-              <w:start w:w="120" w:type="dxa"/>
-              <w:bottom w:w="110" w:type="dxa"/>
-              <w:end w:w="120" w:type="dxa"/>
-            </w:tcMar>
-            <w:vAlign w:val="center"/>
-          </w:tcPr>
-          <w:p>
-            <w:r>
-              <w:rPr>
-                <w:rFonts w:ascii="Aptos" w:hAnsi="Aptos"/>
-                <w:sz w:val="18"/>
-              </w:rPr>
-              <w:t>Structured turns, evidence-aware wording, questions, and workflow proposals</w:t>
-            </w:r>
-          </w:p>
-        </w:tc>
-        <w:tc>
-          <w:tcPr>
-            <w:tcW w:type="dxa" w:w="2736"/>
-            <w:tcBorders>
-              <w:top w:val="single" w:sz="4" w:color="D9D9D9"/>
-              <w:left w:val="single" w:sz="4" w:color="D9D9D9"/>
-              <w:bottom w:val="single" w:sz="4" w:color="D9D9D9"/>
-              <w:right w:val="single" w:sz="4" w:color="D9D9D9"/>
-              <w:insideH w:val="single" w:sz="4" w:color="D9D9D9"/>
-              <w:insideV w:val="single" w:sz="4" w:color="D9D9D9"/>
-            </w:tcBorders>
-            <w:tcMar>
-              <w:top w:w="110" w:type="dxa"/>
-              <w:start w:w="120" w:type="dxa"/>
-              <w:bottom w:w="110" w:type="dxa"/>
-              <w:end w:w="120" w:type="dxa"/>
-            </w:tcMar>
-            <w:vAlign w:val="center"/>
-          </w:tcPr>
-          <w:p>
-            <w:r>
-              <w:rPr>
-                <w:rFonts w:ascii="Aptos" w:hAnsi="Aptos"/>
-                <w:sz w:val="18"/>
-              </w:rPr>
-              <w:t>DeepSeek compatible API and OpenAI Agents SDK</w:t>
-            </w:r>
-          </w:p>
-        </w:tc>
-      </w:tr>
-      <w:tr>
-        <w:trPr>
-          <w:cantSplit/>
-        </w:trPr>
-        <w:tc>
-          <w:tcPr>
-            <w:tcW w:type="dxa" w:w="1656"/>
-            <w:tcBorders>
-              <w:top w:val="single" w:sz="4" w:color="D9D9D9"/>
-              <w:left w:val="single" w:sz="4" w:color="D9D9D9"/>
-              <w:bottom w:val="single" w:sz="4" w:color="D9D9D9"/>
-              <w:right w:val="single" w:sz="4" w:color="D9D9D9"/>
-              <w:insideH w:val="single" w:sz="4" w:color="D9D9D9"/>
-              <w:insideV w:val="single" w:sz="4" w:color="D9D9D9"/>
-            </w:tcBorders>
-            <w:tcMar>
-              <w:top w:w="110" w:type="dxa"/>
-              <w:start w:w="120" w:type="dxa"/>
-              <w:bottom w:w="110" w:type="dxa"/>
-              <w:end w:w="120" w:type="dxa"/>
-            </w:tcMar>
-            <w:shd w:fill="F2F6FA"/>
-            <w:vAlign w:val="center"/>
-          </w:tcPr>
-          <w:p>
-            <w:r>
-              <w:rPr>
-                <w:rFonts w:ascii="Aptos" w:hAnsi="Aptos"/>
-                <w:sz w:val="18"/>
-              </w:rPr>
-              <w:t>Safety controller</w:t>
-            </w:r>
-          </w:p>
-        </w:tc>
-        <w:tc>
-          <w:tcPr>
-            <w:tcW w:type="dxa" w:w="5400"/>
-            <w:tcBorders>
-              <w:top w:val="single" w:sz="4" w:color="D9D9D9"/>
-              <w:left w:val="single" w:sz="4" w:color="D9D9D9"/>
-              <w:bottom w:val="single" w:sz="4" w:color="D9D9D9"/>
-              <w:right w:val="single" w:sz="4" w:color="D9D9D9"/>
-              <w:insideH w:val="single" w:sz="4" w:color="D9D9D9"/>
-              <w:insideV w:val="single" w:sz="4" w:color="D9D9D9"/>
-            </w:tcBorders>
-            <w:tcMar>
-              <w:top w:w="110" w:type="dxa"/>
-              <w:start w:w="120" w:type="dxa"/>
-              <w:bottom w:w="110" w:type="dxa"/>
-              <w:end w:w="120" w:type="dxa"/>
-            </w:tcMar>
-            <w:shd w:fill="F2F6FA"/>
-            <w:vAlign w:val="center"/>
-          </w:tcPr>
-          <w:p>
-            <w:r>
-              <w:rPr>
-                <w:rFonts w:ascii="Aptos" w:hAnsi="Aptos"/>
-                <w:sz w:val="18"/>
-              </w:rPr>
-              <w:t>Stage order, approval gates, draft validation, and audit entries</w:t>
-            </w:r>
-          </w:p>
-        </w:tc>
-        <w:tc>
-          <w:tcPr>
-            <w:tcW w:type="dxa" w:w="2736"/>
-            <w:tcBorders>
-              <w:top w:val="single" w:sz="4" w:color="D9D9D9"/>
-              <w:left w:val="single" w:sz="4" w:color="D9D9D9"/>
-              <w:bottom w:val="single" w:sz="4" w:color="D9D9D9"/>
-              <w:right w:val="single" w:sz="4" w:color="D9D9D9"/>
-              <w:insideH w:val="single" w:sz="4" w:color="D9D9D9"/>
-              <w:insideV w:val="single" w:sz="4" w:color="D9D9D9"/>
-            </w:tcBorders>
-            <w:tcMar>
-              <w:top w:w="110" w:type="dxa"/>
-              <w:start w:w="120" w:type="dxa"/>
-              <w:bottom w:w="110" w:type="dxa"/>
-              <w:end w:w="120" w:type="dxa"/>
-            </w:tcMar>
-            <w:shd w:fill="F2F6FA"/>
-            <w:vAlign w:val="center"/>
-          </w:tcPr>
-          <w:p>
-            <w:r>
-              <w:rPr>
-                <w:rFonts w:ascii="Aptos" w:hAnsi="Aptos"/>
-                <w:sz w:val="18"/>
-              </w:rPr>
-              <w:t>Deterministic Python rules</w:t>
-            </w:r>
-          </w:p>
-        </w:tc>
-      </w:tr>
-      <w:tr>
-        <w:trPr>
-          <w:cantSplit/>
-        </w:trPr>
-        <w:tc>
-          <w:tcPr>
-            <w:tcW w:type="dxa" w:w="1656"/>
-            <w:tcBorders>
-              <w:top w:val="single" w:sz="4" w:color="D9D9D9"/>
-              <w:left w:val="single" w:sz="4" w:color="D9D9D9"/>
-              <w:bottom w:val="single" w:sz="4" w:color="D9D9D9"/>
-              <w:right w:val="single" w:sz="4" w:color="D9D9D9"/>
-              <w:insideH w:val="single" w:sz="4" w:color="D9D9D9"/>
-              <w:insideV w:val="single" w:sz="4" w:color="D9D9D9"/>
-            </w:tcBorders>
-            <w:tcMar>
-              <w:top w:w="110" w:type="dxa"/>
-              <w:start w:w="120" w:type="dxa"/>
-              <w:bottom w:w="110" w:type="dxa"/>
-              <w:end w:w="120" w:type="dxa"/>
-            </w:tcMar>
-            <w:vAlign w:val="center"/>
-          </w:tcPr>
-          <w:p>
-            <w:r>
-              <w:rPr>
-                <w:rFonts w:ascii="Aptos" w:hAnsi="Aptos"/>
-                <w:sz w:val="18"/>
-              </w:rPr>
-              <w:t>Document layer</w:t>
-            </w:r>
-          </w:p>
-        </w:tc>
-        <w:tc>
-          <w:tcPr>
-            <w:tcW w:type="dxa" w:w="5400"/>
-            <w:tcBorders>
-              <w:top w:val="single" w:sz="4" w:color="D9D9D9"/>
-              <w:left w:val="single" w:sz="4" w:color="D9D9D9"/>
-              <w:bottom w:val="single" w:sz="4" w:color="D9D9D9"/>
-              <w:right w:val="single" w:sz="4" w:color="D9D9D9"/>
-              <w:insideH w:val="single" w:sz="4" w:color="D9D9D9"/>
-              <w:insideV w:val="single" w:sz="4" w:color="D9D9D9"/>
-            </w:tcBorders>
-            <w:tcMar>
-              <w:top w:w="110" w:type="dxa"/>
-              <w:start w:w="120" w:type="dxa"/>
-              <w:bottom w:w="110" w:type="dxa"/>
-              <w:end w:w="120" w:type="dxa"/>
-            </w:tcMar>
-            <w:vAlign w:val="center"/>
-          </w:tcPr>
-          <w:p>
-            <w:r>
-              <w:rPr>
-                <w:rFonts w:ascii="Aptos" w:hAnsi="Aptos"/>
-                <w:sz w:val="18"/>
-              </w:rPr>
-              <w:t>DOCX/PDF extraction and one-page PDF generation</w:t>
-            </w:r>
-          </w:p>
-        </w:tc>
-        <w:tc>
-          <w:tcPr>
-            <w:tcW w:type="dxa" w:w="2736"/>
-            <w:tcBorders>
-              <w:top w:val="single" w:sz="4" w:color="D9D9D9"/>
-              <w:left w:val="single" w:sz="4" w:color="D9D9D9"/>
-              <w:bottom w:val="single" w:sz="4" w:color="D9D9D9"/>
-              <w:right w:val="single" w:sz="4" w:color="D9D9D9"/>
-              <w:insideH w:val="single" w:sz="4" w:color="D9D9D9"/>
-              <w:insideV w:val="single" w:sz="4" w:color="D9D9D9"/>
-            </w:tcBorders>
-            <w:tcMar>
-              <w:top w:w="110" w:type="dxa"/>
-              <w:start w:w="120" w:type="dxa"/>
-              <w:bottom w:w="110" w:type="dxa"/>
-              <w:end w:w="120" w:type="dxa"/>
-            </w:tcMar>
-            <w:vAlign w:val="center"/>
-          </w:tcPr>
-          <w:p>
-            <w:r>
-              <w:rPr>
-                <w:rFonts w:ascii="Aptos" w:hAnsi="Aptos"/>
-                <w:sz w:val="18"/>
-              </w:rPr>
-              <w:t>python-docx, pypdf, ReportLab</w:t>
-            </w:r>
-          </w:p>
-        </w:tc>
-      </w:tr>
-      <w:tr>
-        <w:trPr>
-          <w:cantSplit/>
-        </w:trPr>
-        <w:tc>
-          <w:tcPr>
-            <w:tcW w:type="dxa" w:w="1656"/>
-            <w:tcBorders>
-              <w:top w:val="single" w:sz="4" w:color="D9D9D9"/>
-              <w:left w:val="single" w:sz="4" w:color="D9D9D9"/>
-              <w:bottom w:val="single" w:sz="4" w:color="D9D9D9"/>
-              <w:right w:val="single" w:sz="4" w:color="D9D9D9"/>
-              <w:insideH w:val="single" w:sz="4" w:color="D9D9D9"/>
-              <w:insideV w:val="single" w:sz="4" w:color="D9D9D9"/>
-            </w:tcBorders>
-            <w:tcMar>
-              <w:top w:w="110" w:type="dxa"/>
-              <w:start w:w="120" w:type="dxa"/>
-              <w:bottom w:w="110" w:type="dxa"/>
-              <w:end w:w="120" w:type="dxa"/>
-            </w:tcMar>
-            <w:shd w:fill="F2F6FA"/>
-            <w:vAlign w:val="center"/>
-          </w:tcPr>
-          <w:p>
-            <w:r>
-              <w:rPr>
-                <w:rFonts w:ascii="Aptos" w:hAnsi="Aptos"/>
-                <w:sz w:val="18"/>
-              </w:rPr>
-              <w:t>Local storage</w:t>
-            </w:r>
-          </w:p>
-        </w:tc>
-        <w:tc>
-          <w:tcPr>
-            <w:tcW w:type="dxa" w:w="5400"/>
-            <w:tcBorders>
-              <w:top w:val="single" w:sz="4" w:color="D9D9D9"/>
-              <w:left w:val="single" w:sz="4" w:color="D9D9D9"/>
-              <w:bottom w:val="single" w:sz="4" w:color="D9D9D9"/>
-              <w:right w:val="single" w:sz="4" w:color="D9D9D9"/>
-              <w:insideH w:val="single" w:sz="4" w:color="D9D9D9"/>
-              <w:insideV w:val="single" w:sz="4" w:color="D9D9D9"/>
-            </w:tcBorders>
-            <w:tcMar>
-              <w:top w:w="110" w:type="dxa"/>
-              <w:start w:w="120" w:type="dxa"/>
-              <w:bottom w:w="110" w:type="dxa"/>
-              <w:end w:w="120" w:type="dxa"/>
-            </w:tcMar>
-            <w:shd w:fill="F2F6FA"/>
-            <w:vAlign w:val="center"/>
-          </w:tcPr>
-          <w:p>
-            <w:r>
-              <w:rPr>
-                <w:rFonts w:ascii="Aptos" w:hAnsi="Aptos"/>
-                <w:sz w:val="18"/>
-              </w:rPr>
-              <w:t>Private session state and configuration</w:t>
-            </w:r>
-          </w:p>
-        </w:tc>
-        <w:tc>
-          <w:tcPr>
-            <w:tcW w:type="dxa" w:w="2736"/>
-            <w:tcBorders>
-              <w:top w:val="single" w:sz="4" w:color="D9D9D9"/>
-              <w:left w:val="single" w:sz="4" w:color="D9D9D9"/>
-              <w:bottom w:val="single" w:sz="4" w:color="D9D9D9"/>
-              <w:right w:val="single" w:sz="4" w:color="D9D9D9"/>
-              <w:insideH w:val="single" w:sz="4" w:color="D9D9D9"/>
-              <w:insideV w:val="single" w:sz="4" w:color="D9D9D9"/>
-            </w:tcBorders>
-            <w:tcMar>
-              <w:top w:w="110" w:type="dxa"/>
-              <w:start w:w="120" w:type="dxa"/>
-              <w:bottom w:w="110" w:type="dxa"/>
-              <w:end w:w="120" w:type="dxa"/>
-            </w:tcMar>
-            <w:shd w:fill="F2F6FA"/>
-            <w:vAlign w:val="center"/>
-          </w:tcPr>
-          <w:p>
-            <w:r>
-              <w:rPr>
-                <w:rFonts w:ascii="Aptos" w:hAnsi="Aptos"/>
-                <w:sz w:val="18"/>
-              </w:rPr>
-              <w:t>JSON files with restricted permissions</w:t>
-            </w:r>
-          </w:p>
-        </w:tc>
-      </w:tr>
-    </w:tbl>
-    <w:p>
-      <w:pPr>
-        <w:spacing w:after="0"/>
-      </w:pPr>
-    </w:p>
-    <w:p>
-      <w:pPr>
-        <w:pStyle w:val="Heading1"/>
-        <w:keepNext/>
-      </w:pPr>
-      <w:r>
-        <w:t>Validation Results</w:t>
-      </w:r>
-    </w:p>
-    <w:p>
-      <w:pPr>
-        <w:keepLines/>
-      </w:pPr>
-      <w:r>
-        <w:t>The current build passed 30 automated tests covering workflow transitions, privacy safeguards, source handling, model selection, configuration import, direct customization, theme persistence, DOCX upload, and single-page PDF export. Package checks and Python compilation also pass. A real local end-to-end test uploaded a fictional DOCX resume, used DeepSeek Flash to review it, advanced from Intake through Source Review to the Personal Profile Record, preserved the course-project context, and excluded the email when instructed. OpenAI GPT-6 Luna and DeepSeek Flash have both been exercised successfully through the application during development.</w:t>
-      </w:r>
-    </w:p>
-    <w:tbl>
-      <w:tblPr>
-        <w:tblW w:type="auto" w:w="0"/>
-        <w:tblLayout w:type="fixed"/>
-        <w:tblLook w:firstColumn="1" w:firstRow="1" w:lastColumn="0" w:lastRow="0" w:noHBand="0" w:noVBand="1" w:val="04A0"/>
-      </w:tblPr>
-      <w:tblGrid>
-        <w:gridCol w:w="3293"/>
-        <w:gridCol w:w="3293"/>
-        <w:gridCol w:w="3293"/>
-      </w:tblGrid>
-      <w:tr>
-        <w:trPr>
-          <w:tblHeader/>
-        </w:trPr>
-        <w:tc>
-          <w:tcPr>
-            <w:tcW w:type="dxa" w:w="2232"/>
-            <w:shd w:fill="1F3A5F"/>
-            <w:tcBorders>
-              <w:top w:val="single" w:sz="4" w:color="D9D9D9"/>
-              <w:left w:val="single" w:sz="4" w:color="D9D9D9"/>
-              <w:bottom w:val="single" w:sz="4" w:color="D9D9D9"/>
-              <w:right w:val="single" w:sz="4" w:color="D9D9D9"/>
-              <w:insideH w:val="single" w:sz="4" w:color="D9D9D9"/>
-              <w:insideV w:val="single" w:sz="4" w:color="D9D9D9"/>
-            </w:tcBorders>
-            <w:tcMar>
-              <w:top w:w="110" w:type="dxa"/>
-              <w:start w:w="120" w:type="dxa"/>
-              <w:bottom w:w="110" w:type="dxa"/>
-              <w:end w:w="120" w:type="dxa"/>
-            </w:tcMar>
-            <w:vAlign w:val="center"/>
-          </w:tcPr>
-          <w:p>
-            <w:pPr>
-              <w:jc w:val="left"/>
-            </w:pPr>
-            <w:r>
-              <w:rPr>
-                <w:rFonts w:ascii="Aptos" w:hAnsi="Aptos"/>
-                <w:b/>
-                <w:color w:val="FFFFFF"/>
-                <w:sz w:val="18"/>
-              </w:rPr>
-              <w:t>Capability</w:t>
-            </w:r>
-          </w:p>
-        </w:tc>
-        <w:tc>
-          <w:tcPr>
-            <w:tcW w:type="dxa" w:w="6120"/>
-            <w:shd w:fill="1F3A5F"/>
-            <w:tcBorders>
-              <w:top w:val="single" w:sz="4" w:color="D9D9D9"/>
-              <w:left w:val="single" w:sz="4" w:color="D9D9D9"/>
-              <w:bottom w:val="single" w:sz="4" w:color="D9D9D9"/>
-              <w:right w:val="single" w:sz="4" w:color="D9D9D9"/>
-              <w:insideH w:val="single" w:sz="4" w:color="D9D9D9"/>
-              <w:insideV w:val="single" w:sz="4" w:color="D9D9D9"/>
-            </w:tcBorders>
-            <w:tcMar>
-              <w:top w:w="110" w:type="dxa"/>
-              <w:start w:w="120" w:type="dxa"/>
-              <w:bottom w:w="110" w:type="dxa"/>
-              <w:end w:w="120" w:type="dxa"/>
-            </w:tcMar>
-            <w:vAlign w:val="center"/>
-          </w:tcPr>
-          <w:p>
-            <w:pPr>
-              <w:jc w:val="left"/>
-            </w:pPr>
-            <w:r>
-              <w:rPr>
-                <w:rFonts w:ascii="Aptos" w:hAnsi="Aptos"/>
-                <w:b/>
-                <w:color w:val="FFFFFF"/>
-                <w:sz w:val="18"/>
-              </w:rPr>
-              <w:t>Verification</w:t>
-            </w:r>
-          </w:p>
-        </w:tc>
-        <w:tc>
-          <w:tcPr>
-            <w:tcW w:type="dxa" w:w="1440"/>
-            <w:shd w:fill="1F3A5F"/>
-            <w:tcBorders>
-              <w:top w:val="single" w:sz="4" w:color="D9D9D9"/>
-              <w:left w:val="single" w:sz="4" w:color="D9D9D9"/>
-              <w:bottom w:val="single" w:sz="4" w:color="D9D9D9"/>
-              <w:right w:val="single" w:sz="4" w:color="D9D9D9"/>
-              <w:insideH w:val="single" w:sz="4" w:color="D9D9D9"/>
-              <w:insideV w:val="single" w:sz="4" w:color="D9D9D9"/>
-            </w:tcBorders>
-            <w:tcMar>
-              <w:top w:w="110" w:type="dxa"/>
-              <w:start w:w="120" w:type="dxa"/>
-              <w:bottom w:w="110" w:type="dxa"/>
-              <w:end w:w="120" w:type="dxa"/>
-            </w:tcMar>
-            <w:vAlign w:val="center"/>
-          </w:tcPr>
-          <w:p>
-            <w:pPr>
-              <w:jc w:val="left"/>
-            </w:pPr>
-            <w:r>
-              <w:rPr>
-                <w:rFonts w:ascii="Aptos" w:hAnsi="Aptos"/>
-                <w:b/>
-                <w:color w:val="FFFFFF"/>
-                <w:sz w:val="18"/>
-              </w:rPr>
-              <w:t>Result</w:t>
-            </w:r>
-          </w:p>
-        </w:tc>
-      </w:tr>
-      <w:tr>
-        <w:trPr>
-          <w:cantSplit/>
-        </w:trPr>
-        <w:tc>
-          <w:tcPr>
-            <w:tcW w:type="dxa" w:w="2232"/>
-            <w:tcBorders>
-              <w:top w:val="single" w:sz="4" w:color="D9D9D9"/>
-              <w:left w:val="single" w:sz="4" w:color="D9D9D9"/>
-              <w:bottom w:val="single" w:sz="4" w:color="D9D9D9"/>
-              <w:right w:val="single" w:sz="4" w:color="D9D9D9"/>
-              <w:insideH w:val="single" w:sz="4" w:color="D9D9D9"/>
-              <w:insideV w:val="single" w:sz="4" w:color="D9D9D9"/>
-            </w:tcBorders>
-            <w:tcMar>
-              <w:top w:w="110" w:type="dxa"/>
-              <w:start w:w="120" w:type="dxa"/>
-              <w:bottom w:w="110" w:type="dxa"/>
-              <w:end w:w="120" w:type="dxa"/>
-            </w:tcMar>
-            <w:vAlign w:val="center"/>
-          </w:tcPr>
-          <w:p>
-            <w:r>
-              <w:rPr>
-                <w:rFonts w:ascii="Aptos" w:hAnsi="Aptos"/>
-                <w:sz w:val="18"/>
-              </w:rPr>
-              <w:t>Local web application</w:t>
-            </w:r>
-          </w:p>
-        </w:tc>
-        <w:tc>
-          <w:tcPr>
-            <w:tcW w:type="dxa" w:w="6120"/>
-            <w:tcBorders>
-              <w:top w:val="single" w:sz="4" w:color="D9D9D9"/>
-              <w:left w:val="single" w:sz="4" w:color="D9D9D9"/>
-              <w:bottom w:val="single" w:sz="4" w:color="D9D9D9"/>
-              <w:right w:val="single" w:sz="4" w:color="D9D9D9"/>
-              <w:insideH w:val="single" w:sz="4" w:color="D9D9D9"/>
-              <w:insideV w:val="single" w:sz="4" w:color="D9D9D9"/>
-            </w:tcBorders>
-            <w:tcMar>
-              <w:top w:w="110" w:type="dxa"/>
-              <w:start w:w="120" w:type="dxa"/>
-              <w:bottom w:w="110" w:type="dxa"/>
-              <w:end w:w="120" w:type="dxa"/>
-            </w:tcMar>
-            <w:vAlign w:val="center"/>
-          </w:tcPr>
-          <w:p>
-            <w:r>
-              <w:rPr>
-                <w:rFonts w:ascii="Aptos" w:hAnsi="Aptos"/>
-                <w:sz w:val="18"/>
-              </w:rPr>
-              <w:t>Started on 127.0.0.1 and inspected in the browser</w:t>
-            </w:r>
-          </w:p>
-        </w:tc>
-        <w:tc>
-          <w:tcPr>
-            <w:tcW w:type="dxa" w:w="1440"/>
-            <w:tcBorders>
-              <w:top w:val="single" w:sz="4" w:color="D9D9D9"/>
-              <w:left w:val="single" w:sz="4" w:color="D9D9D9"/>
-              <w:bottom w:val="single" w:sz="4" w:color="D9D9D9"/>
-              <w:right w:val="single" w:sz="4" w:color="D9D9D9"/>
-              <w:insideH w:val="single" w:sz="4" w:color="D9D9D9"/>
-              <w:insideV w:val="single" w:sz="4" w:color="D9D9D9"/>
-            </w:tcBorders>
-            <w:tcMar>
-              <w:top w:w="110" w:type="dxa"/>
-              <w:start w:w="120" w:type="dxa"/>
-              <w:bottom w:w="110" w:type="dxa"/>
-              <w:end w:w="120" w:type="dxa"/>
-            </w:tcMar>
-            <w:vAlign w:val="center"/>
-          </w:tcPr>
-          <w:p>
-            <w:r>
-              <w:rPr>
-                <w:rFonts w:ascii="Aptos" w:hAnsi="Aptos"/>
-                <w:sz w:val="18"/>
-              </w:rPr>
-              <w:t>Pass</w:t>
-            </w:r>
-          </w:p>
-        </w:tc>
-      </w:tr>
-      <w:tr>
-        <w:trPr>
-          <w:cantSplit/>
-        </w:trPr>
-        <w:tc>
-          <w:tcPr>
-            <w:tcW w:type="dxa" w:w="2232"/>
-            <w:tcBorders>
-              <w:top w:val="single" w:sz="4" w:color="D9D9D9"/>
-              <w:left w:val="single" w:sz="4" w:color="D9D9D9"/>
-              <w:bottom w:val="single" w:sz="4" w:color="D9D9D9"/>
-              <w:right w:val="single" w:sz="4" w:color="D9D9D9"/>
-              <w:insideH w:val="single" w:sz="4" w:color="D9D9D9"/>
-              <w:insideV w:val="single" w:sz="4" w:color="D9D9D9"/>
-            </w:tcBorders>
-            <w:tcMar>
-              <w:top w:w="110" w:type="dxa"/>
-              <w:start w:w="120" w:type="dxa"/>
-              <w:bottom w:w="110" w:type="dxa"/>
-              <w:end w:w="120" w:type="dxa"/>
-            </w:tcMar>
-            <w:shd w:fill="F2F6FA"/>
-            <w:vAlign w:val="center"/>
-          </w:tcPr>
-          <w:p>
-            <w:r>
-              <w:rPr>
-                <w:rFonts w:ascii="Aptos" w:hAnsi="Aptos"/>
-                <w:sz w:val="18"/>
-              </w:rPr>
-              <w:t>DOCX resume upload</w:t>
-            </w:r>
-          </w:p>
-        </w:tc>
-        <w:tc>
-          <w:tcPr>
-            <w:tcW w:type="dxa" w:w="6120"/>
-            <w:tcBorders>
-              <w:top w:val="single" w:sz="4" w:color="D9D9D9"/>
-              <w:left w:val="single" w:sz="4" w:color="D9D9D9"/>
-              <w:bottom w:val="single" w:sz="4" w:color="D9D9D9"/>
-              <w:right w:val="single" w:sz="4" w:color="D9D9D9"/>
-              <w:insideH w:val="single" w:sz="4" w:color="D9D9D9"/>
-              <w:insideV w:val="single" w:sz="4" w:color="D9D9D9"/>
-            </w:tcBorders>
-            <w:tcMar>
-              <w:top w:w="110" w:type="dxa"/>
-              <w:start w:w="120" w:type="dxa"/>
-              <w:bottom w:w="110" w:type="dxa"/>
-              <w:end w:w="120" w:type="dxa"/>
-            </w:tcMar>
-            <w:shd w:fill="F2F6FA"/>
-            <w:vAlign w:val="center"/>
-          </w:tcPr>
-          <w:p>
-            <w:r>
-              <w:rPr>
-                <w:rFonts w:ascii="Aptos" w:hAnsi="Aptos"/>
-                <w:sz w:val="18"/>
-              </w:rPr>
-              <w:t>Extracted a fictional resume and queued it for model review</w:t>
-            </w:r>
-          </w:p>
-        </w:tc>
-        <w:tc>
-          <w:tcPr>
-            <w:tcW w:type="dxa" w:w="1440"/>
-            <w:tcBorders>
-              <w:top w:val="single" w:sz="4" w:color="D9D9D9"/>
-              <w:left w:val="single" w:sz="4" w:color="D9D9D9"/>
-              <w:bottom w:val="single" w:sz="4" w:color="D9D9D9"/>
-              <w:right w:val="single" w:sz="4" w:color="D9D9D9"/>
-              <w:insideH w:val="single" w:sz="4" w:color="D9D9D9"/>
-              <w:insideV w:val="single" w:sz="4" w:color="D9D9D9"/>
-            </w:tcBorders>
-            <w:tcMar>
-              <w:top w:w="110" w:type="dxa"/>
-              <w:start w:w="120" w:type="dxa"/>
-              <w:bottom w:w="110" w:type="dxa"/>
-              <w:end w:w="120" w:type="dxa"/>
-            </w:tcMar>
-            <w:shd w:fill="F2F6FA"/>
-            <w:vAlign w:val="center"/>
-          </w:tcPr>
-          <w:p>
-            <w:r>
-              <w:rPr>
-                <w:rFonts w:ascii="Aptos" w:hAnsi="Aptos"/>
-                <w:sz w:val="18"/>
-              </w:rPr>
-              <w:t>Pass</w:t>
-            </w:r>
-          </w:p>
-        </w:tc>
-      </w:tr>
-      <w:tr>
-        <w:trPr>
-          <w:cantSplit/>
-        </w:trPr>
-        <w:tc>
-          <w:tcPr>
-            <w:tcW w:type="dxa" w:w="2232"/>
-            <w:tcBorders>
-              <w:top w:val="single" w:sz="4" w:color="D9D9D9"/>
-              <w:left w:val="single" w:sz="4" w:color="D9D9D9"/>
-              <w:bottom w:val="single" w:sz="4" w:color="D9D9D9"/>
-              <w:right w:val="single" w:sz="4" w:color="D9D9D9"/>
-              <w:insideH w:val="single" w:sz="4" w:color="D9D9D9"/>
-              <w:insideV w:val="single" w:sz="4" w:color="D9D9D9"/>
-            </w:tcBorders>
-            <w:tcMar>
-              <w:top w:w="110" w:type="dxa"/>
-              <w:start w:w="120" w:type="dxa"/>
-              <w:bottom w:w="110" w:type="dxa"/>
-              <w:end w:w="120" w:type="dxa"/>
-            </w:tcMar>
-            <w:vAlign w:val="center"/>
-          </w:tcPr>
-          <w:p>
-            <w:r>
-              <w:rPr>
-                <w:rFonts w:ascii="Aptos" w:hAnsi="Aptos"/>
-                <w:sz w:val="18"/>
-              </w:rPr>
-              <w:t>Configuration import</w:t>
-            </w:r>
-          </w:p>
-        </w:tc>
-        <w:tc>
-          <w:tcPr>
-            <w:tcW w:type="dxa" w:w="6120"/>
-            <w:tcBorders>
-              <w:top w:val="single" w:sz="4" w:color="D9D9D9"/>
-              <w:left w:val="single" w:sz="4" w:color="D9D9D9"/>
-              <w:bottom w:val="single" w:sz="4" w:color="D9D9D9"/>
-              <w:right w:val="single" w:sz="4" w:color="D9D9D9"/>
-              <w:insideH w:val="single" w:sz="4" w:color="D9D9D9"/>
-              <w:insideV w:val="single" w:sz="4" w:color="D9D9D9"/>
-            </w:tcBorders>
-            <w:tcMar>
-              <w:top w:w="110" w:type="dxa"/>
-              <w:start w:w="120" w:type="dxa"/>
-              <w:bottom w:w="110" w:type="dxa"/>
-              <w:end w:w="120" w:type="dxa"/>
-            </w:tcMar>
-            <w:vAlign w:val="center"/>
-          </w:tcPr>
-          <w:p>
-            <w:r>
-              <w:rPr>
-                <w:rFonts w:ascii="Aptos" w:hAnsi="Aptos"/>
-                <w:sz w:val="18"/>
-              </w:rPr>
-              <w:t>Applied default_config.json without an API call</w:t>
-            </w:r>
-          </w:p>
-        </w:tc>
-        <w:tc>
-          <w:tcPr>
-            <w:tcW w:type="dxa" w:w="1440"/>
-            <w:tcBorders>
-              <w:top w:val="single" w:sz="4" w:color="D9D9D9"/>
-              <w:left w:val="single" w:sz="4" w:color="D9D9D9"/>
-              <w:bottom w:val="single" w:sz="4" w:color="D9D9D9"/>
-              <w:right w:val="single" w:sz="4" w:color="D9D9D9"/>
-              <w:insideH w:val="single" w:sz="4" w:color="D9D9D9"/>
-              <w:insideV w:val="single" w:sz="4" w:color="D9D9D9"/>
-            </w:tcBorders>
-            <w:tcMar>
-              <w:top w:w="110" w:type="dxa"/>
-              <w:start w:w="120" w:type="dxa"/>
-              <w:bottom w:w="110" w:type="dxa"/>
-              <w:end w:w="120" w:type="dxa"/>
-            </w:tcMar>
-            <w:vAlign w:val="center"/>
-          </w:tcPr>
-          <w:p>
-            <w:r>
-              <w:rPr>
-                <w:rFonts w:ascii="Aptos" w:hAnsi="Aptos"/>
-                <w:sz w:val="18"/>
-              </w:rPr>
-              <w:t>Pass</w:t>
-            </w:r>
-          </w:p>
-        </w:tc>
-      </w:tr>
-      <w:tr>
-        <w:trPr>
-          <w:cantSplit/>
-        </w:trPr>
-        <w:tc>
-          <w:tcPr>
-            <w:tcW w:type="dxa" w:w="2232"/>
-            <w:tcBorders>
-              <w:top w:val="single" w:sz="4" w:color="D9D9D9"/>
-              <w:left w:val="single" w:sz="4" w:color="D9D9D9"/>
-              <w:bottom w:val="single" w:sz="4" w:color="D9D9D9"/>
-              <w:right w:val="single" w:sz="4" w:color="D9D9D9"/>
-              <w:insideH w:val="single" w:sz="4" w:color="D9D9D9"/>
-              <w:insideV w:val="single" w:sz="4" w:color="D9D9D9"/>
-            </w:tcBorders>
-            <w:tcMar>
-              <w:top w:w="110" w:type="dxa"/>
-              <w:start w:w="120" w:type="dxa"/>
-              <w:bottom w:w="110" w:type="dxa"/>
-              <w:end w:w="120" w:type="dxa"/>
-            </w:tcMar>
-            <w:shd w:fill="F2F6FA"/>
-            <w:vAlign w:val="center"/>
-          </w:tcPr>
-          <w:p>
-            <w:r>
-              <w:rPr>
-                <w:rFonts w:ascii="Aptos" w:hAnsi="Aptos"/>
-                <w:sz w:val="18"/>
-              </w:rPr>
-              <w:t>DeepSeek agent flow</w:t>
-            </w:r>
-          </w:p>
-        </w:tc>
-        <w:tc>
-          <w:tcPr>
-            <w:tcW w:type="dxa" w:w="6120"/>
-            <w:tcBorders>
-              <w:top w:val="single" w:sz="4" w:color="D9D9D9"/>
-              <w:left w:val="single" w:sz="4" w:color="D9D9D9"/>
-              <w:bottom w:val="single" w:sz="4" w:color="D9D9D9"/>
-              <w:right w:val="single" w:sz="4" w:color="D9D9D9"/>
-              <w:insideH w:val="single" w:sz="4" w:color="D9D9D9"/>
-              <w:insideV w:val="single" w:sz="4" w:color="D9D9D9"/>
-            </w:tcBorders>
-            <w:tcMar>
-              <w:top w:w="110" w:type="dxa"/>
-              <w:start w:w="120" w:type="dxa"/>
-              <w:bottom w:w="110" w:type="dxa"/>
-              <w:end w:w="120" w:type="dxa"/>
-            </w:tcMar>
-            <w:shd w:fill="F2F6FA"/>
-            <w:vAlign w:val="center"/>
-          </w:tcPr>
-          <w:p>
-            <w:r>
-              <w:rPr>
-                <w:rFonts w:ascii="Aptos" w:hAnsi="Aptos"/>
-                <w:sz w:val="18"/>
-              </w:rPr>
-              <w:t>Completed two structured turns through the local API</w:t>
-            </w:r>
-          </w:p>
-        </w:tc>
-        <w:tc>
-          <w:tcPr>
-            <w:tcW w:type="dxa" w:w="1440"/>
-            <w:tcBorders>
-              <w:top w:val="single" w:sz="4" w:color="D9D9D9"/>
-              <w:left w:val="single" w:sz="4" w:color="D9D9D9"/>
-              <w:bottom w:val="single" w:sz="4" w:color="D9D9D9"/>
-              <w:right w:val="single" w:sz="4" w:color="D9D9D9"/>
-              <w:insideH w:val="single" w:sz="4" w:color="D9D9D9"/>
-              <w:insideV w:val="single" w:sz="4" w:color="D9D9D9"/>
-            </w:tcBorders>
-            <w:tcMar>
-              <w:top w:w="110" w:type="dxa"/>
-              <w:start w:w="120" w:type="dxa"/>
-              <w:bottom w:w="110" w:type="dxa"/>
-              <w:end w:w="120" w:type="dxa"/>
-            </w:tcMar>
-            <w:shd w:fill="F2F6FA"/>
-            <w:vAlign w:val="center"/>
-          </w:tcPr>
-          <w:p>
-            <w:r>
-              <w:rPr>
-                <w:rFonts w:ascii="Aptos" w:hAnsi="Aptos"/>
-                <w:sz w:val="18"/>
-              </w:rPr>
-              <w:t>Pass</w:t>
-            </w:r>
-          </w:p>
-        </w:tc>
-      </w:tr>
-      <w:tr>
-        <w:trPr>
-          <w:cantSplit/>
-        </w:trPr>
-        <w:tc>
-          <w:tcPr>
-            <w:tcW w:type="dxa" w:w="2232"/>
-            <w:tcBorders>
-              <w:top w:val="single" w:sz="4" w:color="D9D9D9"/>
-              <w:left w:val="single" w:sz="4" w:color="D9D9D9"/>
-              <w:bottom w:val="single" w:sz="4" w:color="D9D9D9"/>
-              <w:right w:val="single" w:sz="4" w:color="D9D9D9"/>
-              <w:insideH w:val="single" w:sz="4" w:color="D9D9D9"/>
-              <w:insideV w:val="single" w:sz="4" w:color="D9D9D9"/>
-            </w:tcBorders>
-            <w:tcMar>
-              <w:top w:w="110" w:type="dxa"/>
-              <w:start w:w="120" w:type="dxa"/>
-              <w:bottom w:w="110" w:type="dxa"/>
-              <w:end w:w="120" w:type="dxa"/>
-            </w:tcMar>
-            <w:vAlign w:val="center"/>
-          </w:tcPr>
-          <w:p>
-            <w:r>
-              <w:rPr>
-                <w:rFonts w:ascii="Aptos" w:hAnsi="Aptos"/>
-                <w:sz w:val="18"/>
-              </w:rPr>
-              <w:t>Privacy filtering</w:t>
-            </w:r>
-          </w:p>
-        </w:tc>
-        <w:tc>
-          <w:tcPr>
-            <w:tcW w:type="dxa" w:w="6120"/>
-            <w:tcBorders>
-              <w:top w:val="single" w:sz="4" w:color="D9D9D9"/>
-              <w:left w:val="single" w:sz="4" w:color="D9D9D9"/>
-              <w:bottom w:val="single" w:sz="4" w:color="D9D9D9"/>
-              <w:right w:val="single" w:sz="4" w:color="D9D9D9"/>
-              <w:insideH w:val="single" w:sz="4" w:color="D9D9D9"/>
-              <w:insideV w:val="single" w:sz="4" w:color="D9D9D9"/>
-            </w:tcBorders>
-            <w:tcMar>
-              <w:top w:w="110" w:type="dxa"/>
-              <w:start w:w="120" w:type="dxa"/>
-              <w:bottom w:w="110" w:type="dxa"/>
-              <w:end w:w="120" w:type="dxa"/>
-            </w:tcMar>
-            <w:vAlign w:val="center"/>
-          </w:tcPr>
-          <w:p>
-            <w:r>
-              <w:rPr>
-                <w:rFonts w:ascii="Aptos" w:hAnsi="Aptos"/>
-                <w:sz w:val="18"/>
-              </w:rPr>
-              <w:t>Excluded an unapproved email from preview and PDF</w:t>
-            </w:r>
-          </w:p>
-        </w:tc>
-        <w:tc>
-          <w:tcPr>
-            <w:tcW w:type="dxa" w:w="1440"/>
-            <w:tcBorders>
-              <w:top w:val="single" w:sz="4" w:color="D9D9D9"/>
-              <w:left w:val="single" w:sz="4" w:color="D9D9D9"/>
-              <w:bottom w:val="single" w:sz="4" w:color="D9D9D9"/>
-              <w:right w:val="single" w:sz="4" w:color="D9D9D9"/>
-              <w:insideH w:val="single" w:sz="4" w:color="D9D9D9"/>
-              <w:insideV w:val="single" w:sz="4" w:color="D9D9D9"/>
-            </w:tcBorders>
-            <w:tcMar>
-              <w:top w:w="110" w:type="dxa"/>
-              <w:start w:w="120" w:type="dxa"/>
-              <w:bottom w:w="110" w:type="dxa"/>
-              <w:end w:w="120" w:type="dxa"/>
-            </w:tcMar>
-            <w:vAlign w:val="center"/>
-          </w:tcPr>
-          <w:p>
-            <w:r>
-              <w:rPr>
-                <w:rFonts w:ascii="Aptos" w:hAnsi="Aptos"/>
-                <w:sz w:val="18"/>
-              </w:rPr>
-              <w:t>Pass</w:t>
-            </w:r>
-          </w:p>
-        </w:tc>
-      </w:tr>
-      <w:tr>
-        <w:trPr>
-          <w:cantSplit/>
-        </w:trPr>
-        <w:tc>
-          <w:tcPr>
-            <w:tcW w:type="dxa" w:w="2232"/>
-            <w:tcBorders>
-              <w:top w:val="single" w:sz="4" w:color="D9D9D9"/>
-              <w:left w:val="single" w:sz="4" w:color="D9D9D9"/>
-              <w:bottom w:val="single" w:sz="4" w:color="D9D9D9"/>
-              <w:right w:val="single" w:sz="4" w:color="D9D9D9"/>
-              <w:insideH w:val="single" w:sz="4" w:color="D9D9D9"/>
-              <w:insideV w:val="single" w:sz="4" w:color="D9D9D9"/>
-            </w:tcBorders>
-            <w:tcMar>
-              <w:top w:w="110" w:type="dxa"/>
-              <w:start w:w="120" w:type="dxa"/>
-              <w:bottom w:w="110" w:type="dxa"/>
-              <w:end w:w="120" w:type="dxa"/>
-            </w:tcMar>
-            <w:shd w:fill="F2F6FA"/>
-            <w:vAlign w:val="center"/>
-          </w:tcPr>
-          <w:p>
-            <w:r>
-              <w:rPr>
-                <w:rFonts w:ascii="Aptos" w:hAnsi="Aptos"/>
-                <w:sz w:val="18"/>
-              </w:rPr>
-              <w:t>PDF export</w:t>
-            </w:r>
-          </w:p>
-        </w:tc>
-        <w:tc>
-          <w:tcPr>
-            <w:tcW w:type="dxa" w:w="6120"/>
-            <w:tcBorders>
-              <w:top w:val="single" w:sz="4" w:color="D9D9D9"/>
-              <w:left w:val="single" w:sz="4" w:color="D9D9D9"/>
-              <w:bottom w:val="single" w:sz="4" w:color="D9D9D9"/>
-              <w:right w:val="single" w:sz="4" w:color="D9D9D9"/>
-              <w:insideH w:val="single" w:sz="4" w:color="D9D9D9"/>
-              <w:insideV w:val="single" w:sz="4" w:color="D9D9D9"/>
-            </w:tcBorders>
-            <w:tcMar>
-              <w:top w:w="110" w:type="dxa"/>
-              <w:start w:w="120" w:type="dxa"/>
-              <w:bottom w:w="110" w:type="dxa"/>
-              <w:end w:w="120" w:type="dxa"/>
-            </w:tcMar>
-            <w:shd w:fill="F2F6FA"/>
-            <w:vAlign w:val="center"/>
-          </w:tcPr>
-          <w:p>
-            <w:r>
-              <w:rPr>
-                <w:rFonts w:ascii="Aptos" w:hAnsi="Aptos"/>
-                <w:sz w:val="18"/>
-              </w:rPr>
-              <w:t>Rendered as one US Letter page and visually inspected</w:t>
-            </w:r>
-          </w:p>
-        </w:tc>
-        <w:tc>
-          <w:tcPr>
-            <w:tcW w:type="dxa" w:w="1440"/>
-            <w:tcBorders>
-              <w:top w:val="single" w:sz="4" w:color="D9D9D9"/>
-              <w:left w:val="single" w:sz="4" w:color="D9D9D9"/>
-              <w:bottom w:val="single" w:sz="4" w:color="D9D9D9"/>
-              <w:right w:val="single" w:sz="4" w:color="D9D9D9"/>
-              <w:insideH w:val="single" w:sz="4" w:color="D9D9D9"/>
-              <w:insideV w:val="single" w:sz="4" w:color="D9D9D9"/>
-            </w:tcBorders>
-            <w:tcMar>
-              <w:top w:w="110" w:type="dxa"/>
-              <w:start w:w="120" w:type="dxa"/>
-              <w:bottom w:w="110" w:type="dxa"/>
-              <w:end w:w="120" w:type="dxa"/>
-            </w:tcMar>
-            <w:shd w:fill="F2F6FA"/>
-            <w:vAlign w:val="center"/>
-          </w:tcPr>
-          <w:p>
-            <w:r>
-              <w:rPr>
-                <w:rFonts w:ascii="Aptos" w:hAnsi="Aptos"/>
-                <w:sz w:val="18"/>
-              </w:rPr>
-              <w:t>Pass</w:t>
-            </w:r>
-          </w:p>
-        </w:tc>
-      </w:tr>
-      <w:tr>
-        <w:trPr>
-          <w:cantSplit/>
-        </w:trPr>
-        <w:tc>
-          <w:tcPr>
-            <w:tcW w:type="dxa" w:w="2232"/>
-            <w:tcBorders>
-              <w:top w:val="single" w:sz="4" w:color="D9D9D9"/>
-              <w:left w:val="single" w:sz="4" w:color="D9D9D9"/>
-              <w:bottom w:val="single" w:sz="4" w:color="D9D9D9"/>
-              <w:right w:val="single" w:sz="4" w:color="D9D9D9"/>
-              <w:insideH w:val="single" w:sz="4" w:color="D9D9D9"/>
-              <w:insideV w:val="single" w:sz="4" w:color="D9D9D9"/>
-            </w:tcBorders>
-            <w:tcMar>
-              <w:top w:w="110" w:type="dxa"/>
-              <w:start w:w="120" w:type="dxa"/>
-              <w:bottom w:w="110" w:type="dxa"/>
-              <w:end w:w="120" w:type="dxa"/>
-            </w:tcMar>
-            <w:vAlign w:val="center"/>
-          </w:tcPr>
-          <w:p>
-            <w:r>
-              <w:rPr>
-                <w:rFonts w:ascii="Aptos" w:hAnsi="Aptos"/>
-                <w:sz w:val="18"/>
-              </w:rPr>
-              <w:t>Automated test suite</w:t>
-            </w:r>
-          </w:p>
-        </w:tc>
-        <w:tc>
-          <w:tcPr>
-            <w:tcW w:type="dxa" w:w="6120"/>
-            <w:tcBorders>
-              <w:top w:val="single" w:sz="4" w:color="D9D9D9"/>
-              <w:left w:val="single" w:sz="4" w:color="D9D9D9"/>
-              <w:bottom w:val="single" w:sz="4" w:color="D9D9D9"/>
-              <w:right w:val="single" w:sz="4" w:color="D9D9D9"/>
-              <w:insideH w:val="single" w:sz="4" w:color="D9D9D9"/>
-              <w:insideV w:val="single" w:sz="4" w:color="D9D9D9"/>
-            </w:tcBorders>
-            <w:tcMar>
-              <w:top w:w="110" w:type="dxa"/>
-              <w:start w:w="120" w:type="dxa"/>
-              <w:bottom w:w="110" w:type="dxa"/>
-              <w:end w:w="120" w:type="dxa"/>
-            </w:tcMar>
-            <w:vAlign w:val="center"/>
-          </w:tcPr>
-          <w:p>
-            <w:r>
-              <w:rPr>
-                <w:rFonts w:ascii="Aptos" w:hAnsi="Aptos"/>
-                <w:sz w:val="18"/>
-              </w:rPr>
-              <w:t>30 tests</w:t>
-            </w:r>
-          </w:p>
-        </w:tc>
-        <w:tc>
-          <w:tcPr>
-            <w:tcW w:type="dxa" w:w="1440"/>
-            <w:tcBorders>
-              <w:top w:val="single" w:sz="4" w:color="D9D9D9"/>
-              <w:left w:val="single" w:sz="4" w:color="D9D9D9"/>
-              <w:bottom w:val="single" w:sz="4" w:color="D9D9D9"/>
-              <w:right w:val="single" w:sz="4" w:color="D9D9D9"/>
-              <w:insideH w:val="single" w:sz="4" w:color="D9D9D9"/>
-              <w:insideV w:val="single" w:sz="4" w:color="D9D9D9"/>
-            </w:tcBorders>
-            <w:tcMar>
-              <w:top w:w="110" w:type="dxa"/>
-              <w:start w:w="120" w:type="dxa"/>
-              <w:bottom w:w="110" w:type="dxa"/>
-              <w:end w:w="120" w:type="dxa"/>
-            </w:tcMar>
-            <w:vAlign w:val="center"/>
-          </w:tcPr>
-          <w:p>
-            <w:r>
-              <w:rPr>
-                <w:rFonts w:ascii="Aptos" w:hAnsi="Aptos"/>
-                <w:sz w:val="18"/>
-              </w:rPr>
-              <w:t>Pass</w:t>
-            </w:r>
-          </w:p>
-        </w:tc>
-      </w:tr>
-    </w:tbl>
-    <w:p>
-      <w:pPr>
-        <w:spacing w:after="0"/>
-      </w:pPr>
-    </w:p>
-    <w:p>
-      <w:pPr>
-        <w:pStyle w:val="Heading1"/>
-        <w:keepNext/>
-      </w:pPr>
-      <w:r>
-        <w:t>Known Limitations and Next Steps</w:t>
-      </w:r>
-    </w:p>
-    <w:p>
-      <w:pPr>
-        <w:pStyle w:val="ListBullet"/>
-      </w:pPr>
-      <w:r>
-        <w:t>The interface does not yet provide drag-and-drop reordering of individual sections.</w:t>
-      </w:r>
-    </w:p>
-    <w:p>
-      <w:pPr>
-        <w:pStyle w:val="ListBullet"/>
-      </w:pPr>
-      <w:r>
-        <w:t>The browser preview and PDF share data and preferences, but their typography engines can still produce small visual differences.</w:t>
-      </w:r>
-    </w:p>
-    <w:p>
-      <w:pPr>
-        <w:pStyle w:val="ListBullet"/>
-      </w:pPr>
-      <w:r>
-        <w:t>Image content is intentionally not interpreted automatically; approved portrait placement remains future work.</w:t>
-      </w:r>
-    </w:p>
-    <w:p>
-      <w:pPr>
-        <w:pStyle w:val="ListBullet"/>
-      </w:pPr>
-      <w:r>
-        <w:t>Gemini is not yet available in the conversation model selector.</w:t>
-      </w:r>
-    </w:p>
-    <w:p>
-      <w:pPr>
-        <w:pStyle w:val="ListBullet"/>
-      </w:pPr>
-      <w:r>
-        <w:t>The PDF exporter prioritizes single-page safety and may omit lower-priority overflow content rather than create a second page; a future version should show an explicit omitted-content list.</w:t>
-      </w:r>
-    </w:p>
-    <w:p>
-      <w:pPr>
-        <w:pStyle w:val="ListBullet"/>
-      </w:pPr>
-      <w:r>
-        <w:t>Formal accessibility compliance and institutional privacy requirements still require human review.</w:t>
-      </w:r>
-    </w:p>
-    <w:p>
-      <w:pPr>
-        <w:pStyle w:val="Heading1"/>
-        <w:keepNext/>
-      </w:pPr>
-      <w:r>
-        <w:t>Conclusion</w:t>
-      </w:r>
-    </w:p>
-    <w:p>
-      <w:pPr>
-        <w:keepLines/>
-      </w:pPr>
-      <w:r>
-        <w:t>ProfileKit demonstrates a practical pattern for combining a language model with deterministic controls. The model helps interpret sources and refine language, while the application retains authority over workflow order, privacy decisions, state, and export. The current local version is suitable for a classroom demonstration because it includes a one-click fictional demo, a repeatable configuration path, editable controls, a live visual result, and a tested PDF output.</w:t>
-      </w:r>
-    </w:p>
-    <w:p>
-      <w:pPr>
-        <w:sectPr>
-          <w:headerReference w:type="default" r:id="rId9"/>
-          <w:footerReference w:type="default" r:id="rId10"/>
-          <w:pgSz w:w="12240" w:h="15840"/>
-          <w:pgMar w:top="1037" w:right="1181" w:bottom="979" w:left="1181" w:header="720" w:footer="720" w:gutter="0"/>
-          <w:cols w:space="720"/>
-          <w:docGrid w:linePitch="360"/>
-        </w:sectPr>
-      </w:pPr>
-    </w:p>
-    <w:p>
-      <w:pPr>
-        <w:pStyle w:val="Heading1"/>
-        <w:keepNext/>
-      </w:pPr>
-      <w:r>
-        <w:t>Appendix A Classroom Demonstration Script</w:t>
-      </w:r>
-    </w:p>
-    <w:p>
-      <w:pPr>
-        <w:keepLines/>
-      </w:pPr>
-      <w:r>
-        <w:t>Use this five-minute sequence to demonstrate the project without relying on personal information.</w:t>
-      </w:r>
-    </w:p>
-    <w:tbl>
-      <w:tblPr>
-        <w:tblW w:type="auto" w:w="0"/>
-        <w:tblLayout w:type="fixed"/>
-        <w:tblLook w:firstColumn="1" w:firstRow="1" w:lastColumn="0" w:lastRow="0" w:noHBand="0" w:noVBand="1" w:val="04A0"/>
-      </w:tblPr>
-      <w:tblGrid>
-        <w:gridCol w:w="3293"/>
-        <w:gridCol w:w="3293"/>
-        <w:gridCol w:w="3293"/>
+        <w:gridCol w:w="3389"/>
+        <w:gridCol w:w="3389"/>
+        <w:gridCol w:w="3389"/>
       </w:tblGrid>
       <w:tr>
         <w:trPr>
@@ -2402,10 +487,10 @@
               <w:insideV w:val="single" w:sz="4" w:color="D9D9D9"/>
             </w:tcBorders>
             <w:tcMar>
-              <w:top w:w="110" w:type="dxa"/>
-              <w:start w:w="120" w:type="dxa"/>
-              <w:bottom w:w="110" w:type="dxa"/>
-              <w:end w:w="120" w:type="dxa"/>
+              <w:top w:w="70" w:type="dxa"/>
+              <w:start w:w="105" w:type="dxa"/>
+              <w:bottom w:w="70" w:type="dxa"/>
+              <w:end w:w="105" w:type="dxa"/>
             </w:tcMar>
             <w:vAlign w:val="center"/>
           </w:tcPr>
@@ -2418,7 +503,7 @@
                 <w:rFonts w:ascii="Aptos" w:hAnsi="Aptos"/>
                 <w:b/>
                 <w:color w:val="FFFFFF"/>
-                <w:sz w:val="18"/>
+                <w:sz w:val="17"/>
               </w:rPr>
               <w:t>Time</w:t>
             </w:r>
@@ -2437,10 +522,10 @@
               <w:insideV w:val="single" w:sz="4" w:color="D9D9D9"/>
             </w:tcBorders>
             <w:tcMar>
-              <w:top w:w="110" w:type="dxa"/>
-              <w:start w:w="120" w:type="dxa"/>
-              <w:bottom w:w="110" w:type="dxa"/>
-              <w:end w:w="120" w:type="dxa"/>
+              <w:top w:w="70" w:type="dxa"/>
+              <w:start w:w="105" w:type="dxa"/>
+              <w:bottom w:w="70" w:type="dxa"/>
+              <w:end w:w="105" w:type="dxa"/>
             </w:tcMar>
             <w:vAlign w:val="center"/>
           </w:tcPr>
@@ -2453,7 +538,7 @@
                 <w:rFonts w:ascii="Aptos" w:hAnsi="Aptos"/>
                 <w:b/>
                 <w:color w:val="FFFFFF"/>
-                <w:sz w:val="18"/>
+                <w:sz w:val="17"/>
               </w:rPr>
               <w:t>Action</w:t>
             </w:r>
@@ -2472,10 +557,10 @@
               <w:insideV w:val="single" w:sz="4" w:color="D9D9D9"/>
             </w:tcBorders>
             <w:tcMar>
-              <w:top w:w="110" w:type="dxa"/>
-              <w:start w:w="120" w:type="dxa"/>
-              <w:bottom w:w="110" w:type="dxa"/>
-              <w:end w:w="120" w:type="dxa"/>
+              <w:top w:w="70" w:type="dxa"/>
+              <w:start w:w="105" w:type="dxa"/>
+              <w:bottom w:w="70" w:type="dxa"/>
+              <w:end w:w="105" w:type="dxa"/>
             </w:tcMar>
             <w:vAlign w:val="center"/>
           </w:tcPr>
@@ -2488,7 +573,7 @@
                 <w:rFonts w:ascii="Aptos" w:hAnsi="Aptos"/>
                 <w:b/>
                 <w:color w:val="FFFFFF"/>
-                <w:sz w:val="18"/>
+                <w:sz w:val="17"/>
               </w:rPr>
               <w:t>What to explain</w:t>
             </w:r>
@@ -2511,10 +596,10 @@
               <w:insideV w:val="single" w:sz="4" w:color="D9D9D9"/>
             </w:tcBorders>
             <w:tcMar>
-              <w:top w:w="110" w:type="dxa"/>
-              <w:start w:w="120" w:type="dxa"/>
-              <w:bottom w:w="110" w:type="dxa"/>
-              <w:end w:w="120" w:type="dxa"/>
+              <w:top w:w="70" w:type="dxa"/>
+              <w:start w:w="105" w:type="dxa"/>
+              <w:bottom w:w="70" w:type="dxa"/>
+              <w:end w:w="105" w:type="dxa"/>
             </w:tcMar>
             <w:vAlign w:val="center"/>
           </w:tcPr>
@@ -2522,7 +607,7 @@
             <w:r>
               <w:rPr>
                 <w:rFonts w:ascii="Aptos" w:hAnsi="Aptos"/>
-                <w:sz w:val="18"/>
+                <w:sz w:val="17"/>
               </w:rPr>
               <w:t>0:00</w:t>
             </w:r>
@@ -2540,10 +625,10 @@
               <w:insideV w:val="single" w:sz="4" w:color="D9D9D9"/>
             </w:tcBorders>
             <w:tcMar>
-              <w:top w:w="110" w:type="dxa"/>
-              <w:start w:w="120" w:type="dxa"/>
-              <w:bottom w:w="110" w:type="dxa"/>
-              <w:end w:w="120" w:type="dxa"/>
+              <w:top w:w="70" w:type="dxa"/>
+              <w:start w:w="105" w:type="dxa"/>
+              <w:bottom w:w="70" w:type="dxa"/>
+              <w:end w:w="105" w:type="dxa"/>
             </w:tcMar>
             <w:vAlign w:val="center"/>
           </w:tcPr>
@@ -2551,9 +636,9 @@
             <w:r>
               <w:rPr>
                 <w:rFonts w:ascii="Aptos" w:hAnsi="Aptos"/>
-                <w:sz w:val="18"/>
+                <w:sz w:val="17"/>
               </w:rPr>
-              <w:t>Start the local app and open http://127.0.0.1:8765</w:t>
+              <w:t>Open the local site; choose DeepSeek Flash.</w:t>
             </w:r>
           </w:p>
         </w:tc>
@@ -2569,10 +654,10 @@
               <w:insideV w:val="single" w:sz="4" w:color="D9D9D9"/>
             </w:tcBorders>
             <w:tcMar>
-              <w:top w:w="110" w:type="dxa"/>
-              <w:start w:w="120" w:type="dxa"/>
-              <w:bottom w:w="110" w:type="dxa"/>
-              <w:end w:w="120" w:type="dxa"/>
+              <w:top w:w="70" w:type="dxa"/>
+              <w:start w:w="105" w:type="dxa"/>
+              <w:bottom w:w="70" w:type="dxa"/>
+              <w:end w:w="105" w:type="dxa"/>
             </w:tcMar>
             <w:vAlign w:val="center"/>
           </w:tcPr>
@@ -2580,9 +665,9 @@
             <w:r>
               <w:rPr>
                 <w:rFonts w:ascii="Aptos" w:hAnsi="Aptos"/>
-                <w:sz w:val="18"/>
+                <w:sz w:val="17"/>
               </w:rPr>
-              <w:t>The application and session run locally; only selected prompts are sent to the chosen model provider.</w:t>
+              <w:t>English-first interface; keys stay server-side.</w:t>
             </w:r>
           </w:p>
         </w:tc>
@@ -2603,10 +688,10 @@
               <w:insideV w:val="single" w:sz="4" w:color="D9D9D9"/>
             </w:tcBorders>
             <w:tcMar>
-              <w:top w:w="110" w:type="dxa"/>
-              <w:start w:w="120" w:type="dxa"/>
-              <w:bottom w:w="110" w:type="dxa"/>
-              <w:end w:w="120" w:type="dxa"/>
+              <w:top w:w="70" w:type="dxa"/>
+              <w:start w:w="105" w:type="dxa"/>
+              <w:bottom w:w="70" w:type="dxa"/>
+              <w:end w:w="105" w:type="dxa"/>
             </w:tcMar>
             <w:shd w:fill="F2F6FA"/>
             <w:vAlign w:val="center"/>
@@ -2615,9 +700,9 @@
             <w:r>
               <w:rPr>
                 <w:rFonts w:ascii="Aptos" w:hAnsi="Aptos"/>
-                <w:sz w:val="18"/>
+                <w:sz w:val="17"/>
               </w:rPr>
-              <w:t>0:30</w:t>
+              <w:t>0:40</w:t>
             </w:r>
           </w:p>
         </w:tc>
@@ -2633,10 +718,10 @@
               <w:insideV w:val="single" w:sz="4" w:color="D9D9D9"/>
             </w:tcBorders>
             <w:tcMar>
-              <w:top w:w="110" w:type="dxa"/>
-              <w:start w:w="120" w:type="dxa"/>
-              <w:bottom w:w="110" w:type="dxa"/>
-              <w:end w:w="120" w:type="dxa"/>
+              <w:top w:w="70" w:type="dxa"/>
+              <w:start w:w="105" w:type="dxa"/>
+              <w:bottom w:w="70" w:type="dxa"/>
+              <w:end w:w="105" w:type="dxa"/>
             </w:tcMar>
             <w:shd w:fill="F2F6FA"/>
             <w:vAlign w:val="center"/>
@@ -2645,9 +730,9 @@
             <w:r>
               <w:rPr>
                 <w:rFonts w:ascii="Aptos" w:hAnsi="Aptos"/>
-                <w:sz w:val="18"/>
+                <w:sz w:val="17"/>
               </w:rPr>
-              <w:t>Click Load demo</w:t>
+              <w:t>Upload a sample CV or load the fictional demo; request an audience-specific profile.</w:t>
             </w:r>
           </w:p>
         </w:tc>
@@ -2663,10 +748,10 @@
               <w:insideV w:val="single" w:sz="4" w:color="D9D9D9"/>
             </w:tcBorders>
             <w:tcMar>
-              <w:top w:w="110" w:type="dxa"/>
-              <w:start w:w="120" w:type="dxa"/>
-              <w:bottom w:w="110" w:type="dxa"/>
-              <w:end w:w="120" w:type="dxa"/>
+              <w:top w:w="70" w:type="dxa"/>
+              <w:start w:w="105" w:type="dxa"/>
+              <w:bottom w:w="70" w:type="dxa"/>
+              <w:end w:w="105" w:type="dxa"/>
             </w:tcMar>
             <w:shd w:fill="F2F6FA"/>
             <w:vAlign w:val="center"/>
@@ -2675,9 +760,9 @@
             <w:r>
               <w:rPr>
                 <w:rFonts w:ascii="Aptos" w:hAnsi="Aptos"/>
-                <w:sz w:val="18"/>
+                <w:sz w:val="17"/>
               </w:rPr>
-              <w:t>The case is fictional and safe for classroom projection.</w:t>
+              <w:t>Sources become evidence and structured items, not automatic permission to publish every detail.</w:t>
             </w:r>
           </w:p>
         </w:tc>
@@ -2698,10 +783,10 @@
               <w:insideV w:val="single" w:sz="4" w:color="D9D9D9"/>
             </w:tcBorders>
             <w:tcMar>
-              <w:top w:w="110" w:type="dxa"/>
-              <w:start w:w="120" w:type="dxa"/>
-              <w:bottom w:w="110" w:type="dxa"/>
-              <w:end w:w="120" w:type="dxa"/>
+              <w:top w:w="70" w:type="dxa"/>
+              <w:start w:w="105" w:type="dxa"/>
+              <w:bottom w:w="70" w:type="dxa"/>
+              <w:end w:w="105" w:type="dxa"/>
             </w:tcMar>
             <w:vAlign w:val="center"/>
           </w:tcPr>
@@ -2709,9 +794,9 @@
             <w:r>
               <w:rPr>
                 <w:rFonts w:ascii="Aptos" w:hAnsi="Aptos"/>
-                <w:sz w:val="18"/>
+                <w:sz w:val="17"/>
               </w:rPr>
-              <w:t>1:00</w:t>
+              <w:t>2:00</w:t>
             </w:r>
           </w:p>
         </w:tc>
@@ -2727,10 +812,10 @@
               <w:insideV w:val="single" w:sz="4" w:color="D9D9D9"/>
             </w:tcBorders>
             <w:tcMar>
-              <w:top w:w="110" w:type="dxa"/>
-              <w:start w:w="120" w:type="dxa"/>
-              <w:bottom w:w="110" w:type="dxa"/>
-              <w:end w:w="120" w:type="dxa"/>
+              <w:top w:w="70" w:type="dxa"/>
+              <w:start w:w="105" w:type="dxa"/>
+              <w:bottom w:w="70" w:type="dxa"/>
+              <w:end w:w="105" w:type="dxa"/>
             </w:tcMar>
             <w:vAlign w:val="center"/>
           </w:tcPr>
@@ -2738,9 +823,9 @@
             <w:r>
               <w:rPr>
                 <w:rFonts w:ascii="Aptos" w:hAnsi="Aptos"/>
-                <w:sz w:val="18"/>
+                <w:sz w:val="17"/>
               </w:rPr>
-              <w:t>Switch between Review record and Live preview</w:t>
+              <w:t>Compare Record and Live Preview; exclude an item and change visual settings.</w:t>
             </w:r>
           </w:p>
         </w:tc>
@@ -2756,10 +841,10 @@
               <w:insideV w:val="single" w:sz="4" w:color="D9D9D9"/>
             </w:tcBorders>
             <w:tcMar>
-              <w:top w:w="110" w:type="dxa"/>
-              <w:start w:w="120" w:type="dxa"/>
-              <w:bottom w:w="110" w:type="dxa"/>
-              <w:end w:w="120" w:type="dxa"/>
+              <w:top w:w="70" w:type="dxa"/>
+              <w:start w:w="105" w:type="dxa"/>
+              <w:bottom w:w="70" w:type="dxa"/>
+              <w:end w:w="105" w:type="dxa"/>
             </w:tcMar>
             <w:vAlign w:val="center"/>
           </w:tcPr>
@@ -2767,9 +852,9 @@
             <w:r>
               <w:rPr>
                 <w:rFonts w:ascii="Aptos" w:hAnsi="Aptos"/>
-                <w:sz w:val="18"/>
+                <w:sz w:val="17"/>
               </w:rPr>
-              <w:t>Evidence review and public presentation are separate views of the same state.</w:t>
+              <w:t>Private review data is separate from public output, and the user controls both content and design.</w:t>
             </w:r>
           </w:p>
         </w:tc>
@@ -2790,10 +875,10 @@
               <w:insideV w:val="single" w:sz="4" w:color="D9D9D9"/>
             </w:tcBorders>
             <w:tcMar>
-              <w:top w:w="110" w:type="dxa"/>
-              <w:start w:w="120" w:type="dxa"/>
-              <w:bottom w:w="110" w:type="dxa"/>
-              <w:end w:w="120" w:type="dxa"/>
+              <w:top w:w="70" w:type="dxa"/>
+              <w:start w:w="105" w:type="dxa"/>
+              <w:bottom w:w="70" w:type="dxa"/>
+              <w:end w:w="105" w:type="dxa"/>
             </w:tcMar>
             <w:shd w:fill="F2F6FA"/>
             <w:vAlign w:val="center"/>
@@ -2802,9 +887,9 @@
             <w:r>
               <w:rPr>
                 <w:rFonts w:ascii="Aptos" w:hAnsi="Aptos"/>
-                <w:sz w:val="18"/>
+                <w:sz w:val="17"/>
               </w:rPr>
-              <w:t>1:40</w:t>
+              <w:t>4:10</w:t>
             </w:r>
           </w:p>
         </w:tc>
@@ -2820,10 +905,10 @@
               <w:insideV w:val="single" w:sz="4" w:color="D9D9D9"/>
             </w:tcBorders>
             <w:tcMar>
-              <w:top w:w="110" w:type="dxa"/>
-              <w:start w:w="120" w:type="dxa"/>
-              <w:bottom w:w="110" w:type="dxa"/>
-              <w:end w:w="120" w:type="dxa"/>
+              <w:top w:w="70" w:type="dxa"/>
+              <w:start w:w="105" w:type="dxa"/>
+              <w:bottom w:w="70" w:type="dxa"/>
+              <w:end w:w="105" w:type="dxa"/>
             </w:tcMar>
             <w:shd w:fill="F2F6FA"/>
             <w:vAlign w:val="center"/>
@@ -2832,9 +917,9 @@
             <w:r>
               <w:rPr>
                 <w:rFonts w:ascii="Aptos" w:hAnsi="Aptos"/>
-                <w:sz w:val="18"/>
+                <w:sz w:val="17"/>
               </w:rPr>
-              <w:t>Exclude or restrict one item</w:t>
+              <w:t>Export and open the PDF.</w:t>
             </w:r>
           </w:p>
         </w:tc>
@@ -2850,10 +935,10 @@
               <w:insideV w:val="single" w:sz="4" w:color="D9D9D9"/>
             </w:tcBorders>
             <w:tcMar>
-              <w:top w:w="110" w:type="dxa"/>
-              <w:start w:w="120" w:type="dxa"/>
-              <w:bottom w:w="110" w:type="dxa"/>
-              <w:end w:w="120" w:type="dxa"/>
+              <w:top w:w="70" w:type="dxa"/>
+              <w:start w:w="105" w:type="dxa"/>
+              <w:bottom w:w="70" w:type="dxa"/>
+              <w:end w:w="105" w:type="dxa"/>
             </w:tcMar>
             <w:shd w:fill="F2F6FA"/>
             <w:vAlign w:val="center"/>
@@ -2862,383 +947,9 @@
             <w:r>
               <w:rPr>
                 <w:rFonts w:ascii="Aptos" w:hAnsi="Aptos"/>
-                <w:sz w:val="18"/>
+                <w:sz w:val="17"/>
               </w:rPr>
-              <w:t>The preview updates immediately and respects item-level privacy decisions.</w:t>
-            </w:r>
-          </w:p>
-        </w:tc>
-      </w:tr>
-      <w:tr>
-        <w:trPr>
-          <w:cantSplit/>
-        </w:trPr>
-        <w:tc>
-          <w:tcPr>
-            <w:tcW w:type="dxa" w:w="936"/>
-            <w:tcBorders>
-              <w:top w:val="single" w:sz="4" w:color="D9D9D9"/>
-              <w:left w:val="single" w:sz="4" w:color="D9D9D9"/>
-              <w:bottom w:val="single" w:sz="4" w:color="D9D9D9"/>
-              <w:right w:val="single" w:sz="4" w:color="D9D9D9"/>
-              <w:insideH w:val="single" w:sz="4" w:color="D9D9D9"/>
-              <w:insideV w:val="single" w:sz="4" w:color="D9D9D9"/>
-            </w:tcBorders>
-            <w:tcMar>
-              <w:top w:w="110" w:type="dxa"/>
-              <w:start w:w="120" w:type="dxa"/>
-              <w:bottom w:w="110" w:type="dxa"/>
-              <w:end w:w="120" w:type="dxa"/>
-            </w:tcMar>
-            <w:vAlign w:val="center"/>
-          </w:tcPr>
-          <w:p>
-            <w:r>
-              <w:rPr>
-                <w:rFonts w:ascii="Aptos" w:hAnsi="Aptos"/>
-                <w:sz w:val="18"/>
-              </w:rPr>
-              <w:t>2:15</w:t>
-            </w:r>
-          </w:p>
-        </w:tc>
-        <w:tc>
-          <w:tcPr>
-            <w:tcW w:type="dxa" w:w="2880"/>
-            <w:tcBorders>
-              <w:top w:val="single" w:sz="4" w:color="D9D9D9"/>
-              <w:left w:val="single" w:sz="4" w:color="D9D9D9"/>
-              <w:bottom w:val="single" w:sz="4" w:color="D9D9D9"/>
-              <w:right w:val="single" w:sz="4" w:color="D9D9D9"/>
-              <w:insideH w:val="single" w:sz="4" w:color="D9D9D9"/>
-              <w:insideV w:val="single" w:sz="4" w:color="D9D9D9"/>
-            </w:tcBorders>
-            <w:tcMar>
-              <w:top w:w="110" w:type="dxa"/>
-              <w:start w:w="120" w:type="dxa"/>
-              <w:bottom w:w="110" w:type="dxa"/>
-              <w:end w:w="120" w:type="dxa"/>
-            </w:tcMar>
-            <w:vAlign w:val="center"/>
-          </w:tcPr>
-          <w:p>
-            <w:r>
-              <w:rPr>
-                <w:rFonts w:ascii="Aptos" w:hAnsi="Aptos"/>
-                <w:sz w:val="18"/>
-              </w:rPr>
-              <w:t>Open Customize</w:t>
-            </w:r>
-          </w:p>
-        </w:tc>
-        <w:tc>
-          <w:tcPr>
-            <w:tcW w:type="dxa" w:w="5976"/>
-            <w:tcBorders>
-              <w:top w:val="single" w:sz="4" w:color="D9D9D9"/>
-              <w:left w:val="single" w:sz="4" w:color="D9D9D9"/>
-              <w:bottom w:val="single" w:sz="4" w:color="D9D9D9"/>
-              <w:right w:val="single" w:sz="4" w:color="D9D9D9"/>
-              <w:insideH w:val="single" w:sz="4" w:color="D9D9D9"/>
-              <w:insideV w:val="single" w:sz="4" w:color="D9D9D9"/>
-            </w:tcBorders>
-            <w:tcMar>
-              <w:top w:w="110" w:type="dxa"/>
-              <w:start w:w="120" w:type="dxa"/>
-              <w:bottom w:w="110" w:type="dxa"/>
-              <w:end w:w="120" w:type="dxa"/>
-            </w:tcMar>
-            <w:vAlign w:val="center"/>
-          </w:tcPr>
-          <w:p>
-            <w:r>
-              <w:rPr>
-                <w:rFonts w:ascii="Aptos" w:hAnsi="Aptos"/>
-                <w:sz w:val="18"/>
-              </w:rPr>
-              <w:t>Change audience, tone, accent color, typography, or density and apply the preferences.</w:t>
-            </w:r>
-          </w:p>
-        </w:tc>
-      </w:tr>
-      <w:tr>
-        <w:trPr>
-          <w:cantSplit/>
-        </w:trPr>
-        <w:tc>
-          <w:tcPr>
-            <w:tcW w:type="dxa" w:w="936"/>
-            <w:tcBorders>
-              <w:top w:val="single" w:sz="4" w:color="D9D9D9"/>
-              <w:left w:val="single" w:sz="4" w:color="D9D9D9"/>
-              <w:bottom w:val="single" w:sz="4" w:color="D9D9D9"/>
-              <w:right w:val="single" w:sz="4" w:color="D9D9D9"/>
-              <w:insideH w:val="single" w:sz="4" w:color="D9D9D9"/>
-              <w:insideV w:val="single" w:sz="4" w:color="D9D9D9"/>
-            </w:tcBorders>
-            <w:tcMar>
-              <w:top w:w="110" w:type="dxa"/>
-              <w:start w:w="120" w:type="dxa"/>
-              <w:bottom w:w="110" w:type="dxa"/>
-              <w:end w:w="120" w:type="dxa"/>
-            </w:tcMar>
-            <w:shd w:fill="F2F6FA"/>
-            <w:vAlign w:val="center"/>
-          </w:tcPr>
-          <w:p>
-            <w:r>
-              <w:rPr>
-                <w:rFonts w:ascii="Aptos" w:hAnsi="Aptos"/>
-                <w:sz w:val="18"/>
-              </w:rPr>
-              <w:t>3:10</w:t>
-            </w:r>
-          </w:p>
-        </w:tc>
-        <w:tc>
-          <w:tcPr>
-            <w:tcW w:type="dxa" w:w="2880"/>
-            <w:tcBorders>
-              <w:top w:val="single" w:sz="4" w:color="D9D9D9"/>
-              <w:left w:val="single" w:sz="4" w:color="D9D9D9"/>
-              <w:bottom w:val="single" w:sz="4" w:color="D9D9D9"/>
-              <w:right w:val="single" w:sz="4" w:color="D9D9D9"/>
-              <w:insideH w:val="single" w:sz="4" w:color="D9D9D9"/>
-              <w:insideV w:val="single" w:sz="4" w:color="D9D9D9"/>
-            </w:tcBorders>
-            <w:tcMar>
-              <w:top w:w="110" w:type="dxa"/>
-              <w:start w:w="120" w:type="dxa"/>
-              <w:bottom w:w="110" w:type="dxa"/>
-              <w:end w:w="120" w:type="dxa"/>
-            </w:tcMar>
-            <w:shd w:fill="F2F6FA"/>
-            <w:vAlign w:val="center"/>
-          </w:tcPr>
-          <w:p>
-            <w:r>
-              <w:rPr>
-                <w:rFonts w:ascii="Aptos" w:hAnsi="Aptos"/>
-                <w:sz w:val="18"/>
-              </w:rPr>
-              <w:t>Switch Academic, Modern, and Minimal themes</w:t>
-            </w:r>
-          </w:p>
-        </w:tc>
-        <w:tc>
-          <w:tcPr>
-            <w:tcW w:type="dxa" w:w="5976"/>
-            <w:tcBorders>
-              <w:top w:val="single" w:sz="4" w:color="D9D9D9"/>
-              <w:left w:val="single" w:sz="4" w:color="D9D9D9"/>
-              <w:bottom w:val="single" w:sz="4" w:color="D9D9D9"/>
-              <w:right w:val="single" w:sz="4" w:color="D9D9D9"/>
-              <w:insideH w:val="single" w:sz="4" w:color="D9D9D9"/>
-              <w:insideV w:val="single" w:sz="4" w:color="D9D9D9"/>
-            </w:tcBorders>
-            <w:tcMar>
-              <w:top w:w="110" w:type="dxa"/>
-              <w:start w:w="120" w:type="dxa"/>
-              <w:bottom w:w="110" w:type="dxa"/>
-              <w:end w:w="120" w:type="dxa"/>
-            </w:tcMar>
-            <w:shd w:fill="F2F6FA"/>
-            <w:vAlign w:val="center"/>
-          </w:tcPr>
-          <w:p>
-            <w:r>
-              <w:rPr>
-                <w:rFonts w:ascii="Aptos" w:hAnsi="Aptos"/>
-                <w:sz w:val="18"/>
-              </w:rPr>
-              <w:t>The user controls design instead of accepting one automatic result.</w:t>
-            </w:r>
-          </w:p>
-        </w:tc>
-      </w:tr>
-      <w:tr>
-        <w:trPr>
-          <w:cantSplit/>
-        </w:trPr>
-        <w:tc>
-          <w:tcPr>
-            <w:tcW w:type="dxa" w:w="936"/>
-            <w:tcBorders>
-              <w:top w:val="single" w:sz="4" w:color="D9D9D9"/>
-              <w:left w:val="single" w:sz="4" w:color="D9D9D9"/>
-              <w:bottom w:val="single" w:sz="4" w:color="D9D9D9"/>
-              <w:right w:val="single" w:sz="4" w:color="D9D9D9"/>
-              <w:insideH w:val="single" w:sz="4" w:color="D9D9D9"/>
-              <w:insideV w:val="single" w:sz="4" w:color="D9D9D9"/>
-            </w:tcBorders>
-            <w:tcMar>
-              <w:top w:w="110" w:type="dxa"/>
-              <w:start w:w="120" w:type="dxa"/>
-              <w:bottom w:w="110" w:type="dxa"/>
-              <w:end w:w="120" w:type="dxa"/>
-            </w:tcMar>
-            <w:vAlign w:val="center"/>
-          </w:tcPr>
-          <w:p>
-            <w:r>
-              <w:rPr>
-                <w:rFonts w:ascii="Aptos" w:hAnsi="Aptos"/>
-                <w:sz w:val="18"/>
-              </w:rPr>
-              <w:t>3:45</w:t>
-            </w:r>
-          </w:p>
-        </w:tc>
-        <w:tc>
-          <w:tcPr>
-            <w:tcW w:type="dxa" w:w="2880"/>
-            <w:tcBorders>
-              <w:top w:val="single" w:sz="4" w:color="D9D9D9"/>
-              <w:left w:val="single" w:sz="4" w:color="D9D9D9"/>
-              <w:bottom w:val="single" w:sz="4" w:color="D9D9D9"/>
-              <w:right w:val="single" w:sz="4" w:color="D9D9D9"/>
-              <w:insideH w:val="single" w:sz="4" w:color="D9D9D9"/>
-              <w:insideV w:val="single" w:sz="4" w:color="D9D9D9"/>
-            </w:tcBorders>
-            <w:tcMar>
-              <w:top w:w="110" w:type="dxa"/>
-              <w:start w:w="120" w:type="dxa"/>
-              <w:bottom w:w="110" w:type="dxa"/>
-              <w:end w:w="120" w:type="dxa"/>
-            </w:tcMar>
-            <w:vAlign w:val="center"/>
-          </w:tcPr>
-          <w:p>
-            <w:r>
-              <w:rPr>
-                <w:rFonts w:ascii="Aptos" w:hAnsi="Aptos"/>
-                <w:sz w:val="18"/>
-              </w:rPr>
-              <w:t>Export PDF</w:t>
-            </w:r>
-          </w:p>
-        </w:tc>
-        <w:tc>
-          <w:tcPr>
-            <w:tcW w:type="dxa" w:w="5976"/>
-            <w:tcBorders>
-              <w:top w:val="single" w:sz="4" w:color="D9D9D9"/>
-              <w:left w:val="single" w:sz="4" w:color="D9D9D9"/>
-              <w:bottom w:val="single" w:sz="4" w:color="D9D9D9"/>
-              <w:right w:val="single" w:sz="4" w:color="D9D9D9"/>
-              <w:insideH w:val="single" w:sz="4" w:color="D9D9D9"/>
-              <w:insideV w:val="single" w:sz="4" w:color="D9D9D9"/>
-            </w:tcBorders>
-            <w:tcMar>
-              <w:top w:w="110" w:type="dxa"/>
-              <w:start w:w="120" w:type="dxa"/>
-              <w:bottom w:w="110" w:type="dxa"/>
-              <w:end w:w="120" w:type="dxa"/>
-            </w:tcMar>
-            <w:vAlign w:val="center"/>
-          </w:tcPr>
-          <w:p>
-            <w:r>
-              <w:rPr>
-                <w:rFonts w:ascii="Aptos" w:hAnsi="Aptos"/>
-                <w:sz w:val="18"/>
-              </w:rPr>
-              <w:t>The exported document is one page and uses the saved privacy and design settings.</w:t>
-            </w:r>
-          </w:p>
-        </w:tc>
-      </w:tr>
-      <w:tr>
-        <w:trPr>
-          <w:cantSplit/>
-        </w:trPr>
-        <w:tc>
-          <w:tcPr>
-            <w:tcW w:type="dxa" w:w="936"/>
-            <w:tcBorders>
-              <w:top w:val="single" w:sz="4" w:color="D9D9D9"/>
-              <w:left w:val="single" w:sz="4" w:color="D9D9D9"/>
-              <w:bottom w:val="single" w:sz="4" w:color="D9D9D9"/>
-              <w:right w:val="single" w:sz="4" w:color="D9D9D9"/>
-              <w:insideH w:val="single" w:sz="4" w:color="D9D9D9"/>
-              <w:insideV w:val="single" w:sz="4" w:color="D9D9D9"/>
-            </w:tcBorders>
-            <w:tcMar>
-              <w:top w:w="110" w:type="dxa"/>
-              <w:start w:w="120" w:type="dxa"/>
-              <w:bottom w:w="110" w:type="dxa"/>
-              <w:end w:w="120" w:type="dxa"/>
-            </w:tcMar>
-            <w:shd w:fill="F2F6FA"/>
-            <w:vAlign w:val="center"/>
-          </w:tcPr>
-          <w:p>
-            <w:r>
-              <w:rPr>
-                <w:rFonts w:ascii="Aptos" w:hAnsi="Aptos"/>
-                <w:sz w:val="18"/>
-              </w:rPr>
-              <w:t>4:20</w:t>
-            </w:r>
-          </w:p>
-        </w:tc>
-        <w:tc>
-          <w:tcPr>
-            <w:tcW w:type="dxa" w:w="2880"/>
-            <w:tcBorders>
-              <w:top w:val="single" w:sz="4" w:color="D9D9D9"/>
-              <w:left w:val="single" w:sz="4" w:color="D9D9D9"/>
-              <w:bottom w:val="single" w:sz="4" w:color="D9D9D9"/>
-              <w:right w:val="single" w:sz="4" w:color="D9D9D9"/>
-              <w:insideH w:val="single" w:sz="4" w:color="D9D9D9"/>
-              <w:insideV w:val="single" w:sz="4" w:color="D9D9D9"/>
-            </w:tcBorders>
-            <w:tcMar>
-              <w:top w:w="110" w:type="dxa"/>
-              <w:start w:w="120" w:type="dxa"/>
-              <w:bottom w:w="110" w:type="dxa"/>
-              <w:end w:w="120" w:type="dxa"/>
-            </w:tcMar>
-            <w:shd w:fill="F2F6FA"/>
-            <w:vAlign w:val="center"/>
-          </w:tcPr>
-          <w:p>
-            <w:r>
-              <w:rPr>
-                <w:rFonts w:ascii="Aptos" w:hAnsi="Aptos"/>
-                <w:sz w:val="18"/>
-              </w:rPr>
-              <w:t>Optionally upload default_config.json</w:t>
-            </w:r>
-          </w:p>
-        </w:tc>
-        <w:tc>
-          <w:tcPr>
-            <w:tcW w:type="dxa" w:w="5976"/>
-            <w:tcBorders>
-              <w:top w:val="single" w:sz="4" w:color="D9D9D9"/>
-              <w:left w:val="single" w:sz="4" w:color="D9D9D9"/>
-              <w:bottom w:val="single" w:sz="4" w:color="D9D9D9"/>
-              <w:right w:val="single" w:sz="4" w:color="D9D9D9"/>
-              <w:insideH w:val="single" w:sz="4" w:color="D9D9D9"/>
-              <w:insideV w:val="single" w:sz="4" w:color="D9D9D9"/>
-            </w:tcBorders>
-            <w:tcMar>
-              <w:top w:w="110" w:type="dxa"/>
-              <w:start w:w="120" w:type="dxa"/>
-              <w:bottom w:w="110" w:type="dxa"/>
-              <w:end w:w="120" w:type="dxa"/>
-            </w:tcMar>
-            <w:shd w:fill="F2F6FA"/>
-            <w:vAlign w:val="center"/>
-          </w:tcPr>
-          <w:p>
-            <w:r>
-              <w:rPr>
-                <w:rFonts w:ascii="Aptos" w:hAnsi="Aptos"/>
-                <w:sz w:val="18"/>
-              </w:rPr>
-              <w:t>This provides a deterministic fallback if an external model is unavailable.</w:t>
+              <w:t>The artifact is one page and reflects the approved visible state.</w:t>
             </w:r>
           </w:p>
         </w:tc>
@@ -3250,25 +961,12 @@
       </w:pPr>
     </w:p>
     <w:p>
-      <w:r>
-        <w:br w:type="page"/>
-      </w:r>
-    </w:p>
-    <w:p>
       <w:pPr>
         <w:pStyle w:val="Heading1"/>
         <w:keepNext/>
       </w:pPr>
       <w:r>
-        <w:t>Appendix B Configuration Reference</w:t>
-      </w:r>
-    </w:p>
-    <w:p>
-      <w:pPr>
-        <w:keepLines/>
-      </w:pPr>
-      <w:r>
-        <w:t>The repository includes default_config.json. Keep that exact filename when uploading it through the web interface. The configuration replaces the existing profile record so a previous demo does not leak into the new result.</w:t>
+        <w:t>Current Validation Status</w:t>
       </w:r>
     </w:p>
     <w:tbl>
@@ -3278,9 +976,8 @@
         <w:tblLook w:firstColumn="1" w:firstRow="1" w:lastColumn="0" w:lastRow="0" w:noHBand="0" w:noVBand="1" w:val="04A0"/>
       </w:tblPr>
       <w:tblGrid>
-        <w:gridCol w:w="3293"/>
-        <w:gridCol w:w="3293"/>
-        <w:gridCol w:w="3293"/>
+        <w:gridCol w:w="5083"/>
+        <w:gridCol w:w="5083"/>
       </w:tblGrid>
       <w:tr>
         <w:trPr>
@@ -3288,7 +985,7 @@
         </w:trPr>
         <w:tc>
           <w:tcPr>
-            <w:tcW w:type="dxa" w:w="1800"/>
+            <w:tcW w:type="dxa" w:w="2088"/>
             <w:shd w:fill="1F3A5F"/>
             <w:tcBorders>
               <w:top w:val="single" w:sz="4" w:color="D9D9D9"/>
@@ -3299,10 +996,10 @@
               <w:insideV w:val="single" w:sz="4" w:color="D9D9D9"/>
             </w:tcBorders>
             <w:tcMar>
-              <w:top w:w="110" w:type="dxa"/>
-              <w:start w:w="120" w:type="dxa"/>
-              <w:bottom w:w="110" w:type="dxa"/>
-              <w:end w:w="120" w:type="dxa"/>
+              <w:top w:w="70" w:type="dxa"/>
+              <w:start w:w="105" w:type="dxa"/>
+              <w:bottom w:w="70" w:type="dxa"/>
+              <w:end w:w="105" w:type="dxa"/>
             </w:tcMar>
             <w:vAlign w:val="center"/>
           </w:tcPr>
@@ -3315,15 +1012,15 @@
                 <w:rFonts w:ascii="Aptos" w:hAnsi="Aptos"/>
                 <w:b/>
                 <w:color w:val="FFFFFF"/>
-                <w:sz w:val="18"/>
+                <w:sz w:val="17"/>
               </w:rPr>
-              <w:t>Object</w:t>
+              <w:t>Check</w:t>
             </w:r>
           </w:p>
         </w:tc>
         <w:tc>
           <w:tcPr>
-            <w:tcW w:type="dxa" w:w="5256"/>
+            <w:tcW w:type="dxa" w:w="7704"/>
             <w:shd w:fill="1F3A5F"/>
             <w:tcBorders>
               <w:top w:val="single" w:sz="4" w:color="D9D9D9"/>
@@ -3334,10 +1031,10 @@
               <w:insideV w:val="single" w:sz="4" w:color="D9D9D9"/>
             </w:tcBorders>
             <w:tcMar>
-              <w:top w:w="110" w:type="dxa"/>
-              <w:start w:w="120" w:type="dxa"/>
-              <w:bottom w:w="110" w:type="dxa"/>
-              <w:end w:w="120" w:type="dxa"/>
+              <w:top w:w="70" w:type="dxa"/>
+              <w:start w:w="105" w:type="dxa"/>
+              <w:bottom w:w="70" w:type="dxa"/>
+              <w:end w:w="105" w:type="dxa"/>
             </w:tcMar>
             <w:vAlign w:val="center"/>
           </w:tcPr>
@@ -3350,44 +1047,9 @@
                 <w:rFonts w:ascii="Aptos" w:hAnsi="Aptos"/>
                 <w:b/>
                 <w:color w:val="FFFFFF"/>
-                <w:sz w:val="18"/>
+                <w:sz w:val="17"/>
               </w:rPr>
-              <w:t>Fields</w:t>
-            </w:r>
-          </w:p>
-        </w:tc>
-        <w:tc>
-          <w:tcPr>
-            <w:tcW w:type="dxa" w:w="2736"/>
-            <w:shd w:fill="1F3A5F"/>
-            <w:tcBorders>
-              <w:top w:val="single" w:sz="4" w:color="D9D9D9"/>
-              <w:left w:val="single" w:sz="4" w:color="D9D9D9"/>
-              <w:bottom w:val="single" w:sz="4" w:color="D9D9D9"/>
-              <w:right w:val="single" w:sz="4" w:color="D9D9D9"/>
-              <w:insideH w:val="single" w:sz="4" w:color="D9D9D9"/>
-              <w:insideV w:val="single" w:sz="4" w:color="D9D9D9"/>
-            </w:tcBorders>
-            <w:tcMar>
-              <w:top w:w="110" w:type="dxa"/>
-              <w:start w:w="120" w:type="dxa"/>
-              <w:bottom w:w="110" w:type="dxa"/>
-              <w:end w:w="120" w:type="dxa"/>
-            </w:tcMar>
-            <w:vAlign w:val="center"/>
-          </w:tcPr>
-          <w:p>
-            <w:pPr>
-              <w:jc w:val="left"/>
-            </w:pPr>
-            <w:r>
-              <w:rPr>
-                <w:rFonts w:ascii="Aptos" w:hAnsi="Aptos"/>
-                <w:b/>
-                <w:color w:val="FFFFFF"/>
-                <w:sz w:val="18"/>
-              </w:rPr>
-              <w:t>Purpose</w:t>
+              <w:t>Verified result</w:t>
             </w:r>
           </w:p>
         </w:tc>
@@ -3398,7 +1060,7 @@
         </w:trPr>
         <w:tc>
           <w:tcPr>
-            <w:tcW w:type="dxa" w:w="1800"/>
+            <w:tcW w:type="dxa" w:w="2088"/>
             <w:tcBorders>
               <w:top w:val="single" w:sz="4" w:color="D9D9D9"/>
               <w:left w:val="single" w:sz="4" w:color="D9D9D9"/>
@@ -3408,10 +1070,10 @@
               <w:insideV w:val="single" w:sz="4" w:color="D9D9D9"/>
             </w:tcBorders>
             <w:tcMar>
-              <w:top w:w="110" w:type="dxa"/>
-              <w:start w:w="120" w:type="dxa"/>
-              <w:bottom w:w="110" w:type="dxa"/>
-              <w:end w:w="120" w:type="dxa"/>
+              <w:top w:w="70" w:type="dxa"/>
+              <w:start w:w="105" w:type="dxa"/>
+              <w:bottom w:w="70" w:type="dxa"/>
+              <w:end w:w="105" w:type="dxa"/>
             </w:tcMar>
             <w:vAlign w:val="center"/>
           </w:tcPr>
@@ -3419,15 +1081,15 @@
             <w:r>
               <w:rPr>
                 <w:rFonts w:ascii="Aptos" w:hAnsi="Aptos"/>
-                <w:sz w:val="18"/>
+                <w:sz w:val="17"/>
               </w:rPr>
-              <w:t>profile_metadata</w:t>
+              <w:t>Automated behavior</w:t>
             </w:r>
           </w:p>
         </w:tc>
         <w:tc>
           <w:tcPr>
-            <w:tcW w:type="dxa" w:w="5256"/>
+            <w:tcW w:type="dxa" w:w="7704"/>
             <w:tcBorders>
               <w:top w:val="single" w:sz="4" w:color="D9D9D9"/>
               <w:left w:val="single" w:sz="4" w:color="D9D9D9"/>
@@ -3437,10 +1099,10 @@
               <w:insideV w:val="single" w:sz="4" w:color="D9D9D9"/>
             </w:tcBorders>
             <w:tcMar>
-              <w:top w:w="110" w:type="dxa"/>
-              <w:start w:w="120" w:type="dxa"/>
-              <w:bottom w:w="110" w:type="dxa"/>
-              <w:end w:w="120" w:type="dxa"/>
+              <w:top w:w="70" w:type="dxa"/>
+              <w:start w:w="105" w:type="dxa"/>
+              <w:bottom w:w="70" w:type="dxa"/>
+              <w:end w:w="105" w:type="dxa"/>
             </w:tcMar>
             <w:vAlign w:val="center"/>
           </w:tcPr>
@@ -3448,38 +1110,9 @@
             <w:r>
               <w:rPr>
                 <w:rFonts w:ascii="Aptos" w:hAnsi="Aptos"/>
-                <w:sz w:val="18"/>
+                <w:sz w:val="17"/>
               </w:rPr>
-              <w:t>audience, occasion, purpose, output_type, output_size, tone, language, accessibility_requirements, visual_preferences, privacy_restrictions</w:t>
-            </w:r>
-          </w:p>
-        </w:tc>
-        <w:tc>
-          <w:tcPr>
-            <w:tcW w:type="dxa" w:w="2736"/>
-            <w:tcBorders>
-              <w:top w:val="single" w:sz="4" w:color="D9D9D9"/>
-              <w:left w:val="single" w:sz="4" w:color="D9D9D9"/>
-              <w:bottom w:val="single" w:sz="4" w:color="D9D9D9"/>
-              <w:right w:val="single" w:sz="4" w:color="D9D9D9"/>
-              <w:insideH w:val="single" w:sz="4" w:color="D9D9D9"/>
-              <w:insideV w:val="single" w:sz="4" w:color="D9D9D9"/>
-            </w:tcBorders>
-            <w:tcMar>
-              <w:top w:w="110" w:type="dxa"/>
-              <w:start w:w="120" w:type="dxa"/>
-              <w:bottom w:w="110" w:type="dxa"/>
-              <w:end w:w="120" w:type="dxa"/>
-            </w:tcMar>
-            <w:vAlign w:val="center"/>
-          </w:tcPr>
-          <w:p>
-            <w:r>
-              <w:rPr>
-                <w:rFonts w:ascii="Aptos" w:hAnsi="Aptos"/>
-                <w:sz w:val="18"/>
-              </w:rPr>
-              <w:t>Defines the intended use and constraints</w:t>
+              <w:t>31 tests cover workflow gates, privacy, models, configuration, uploads, customization, and one-page export.</w:t>
             </w:r>
           </w:p>
         </w:tc>
@@ -3490,7 +1123,7 @@
         </w:trPr>
         <w:tc>
           <w:tcPr>
-            <w:tcW w:type="dxa" w:w="1800"/>
+            <w:tcW w:type="dxa" w:w="2088"/>
             <w:tcBorders>
               <w:top w:val="single" w:sz="4" w:color="D9D9D9"/>
               <w:left w:val="single" w:sz="4" w:color="D9D9D9"/>
@@ -3500,10 +1133,10 @@
               <w:insideV w:val="single" w:sz="4" w:color="D9D9D9"/>
             </w:tcBorders>
             <w:tcMar>
-              <w:top w:w="110" w:type="dxa"/>
-              <w:start w:w="120" w:type="dxa"/>
-              <w:bottom w:w="110" w:type="dxa"/>
-              <w:end w:w="120" w:type="dxa"/>
+              <w:top w:w="70" w:type="dxa"/>
+              <w:start w:w="105" w:type="dxa"/>
+              <w:bottom w:w="70" w:type="dxa"/>
+              <w:end w:w="105" w:type="dxa"/>
             </w:tcMar>
             <w:shd w:fill="F2F6FA"/>
             <w:vAlign w:val="center"/>
@@ -3512,15 +1145,15 @@
             <w:r>
               <w:rPr>
                 <w:rFonts w:ascii="Aptos" w:hAnsi="Aptos"/>
-                <w:sz w:val="18"/>
+                <w:sz w:val="17"/>
               </w:rPr>
-              <w:t>profile</w:t>
+              <w:t>Local web app</w:t>
             </w:r>
           </w:p>
         </w:tc>
         <w:tc>
           <w:tcPr>
-            <w:tcW w:type="dxa" w:w="5256"/>
+            <w:tcW w:type="dxa" w:w="7704"/>
             <w:tcBorders>
               <w:top w:val="single" w:sz="4" w:color="D9D9D9"/>
               <w:left w:val="single" w:sz="4" w:color="D9D9D9"/>
@@ -3530,10 +1163,10 @@
               <w:insideV w:val="single" w:sz="4" w:color="D9D9D9"/>
             </w:tcBorders>
             <w:tcMar>
-              <w:top w:w="110" w:type="dxa"/>
-              <w:start w:w="120" w:type="dxa"/>
-              <w:bottom w:w="110" w:type="dxa"/>
-              <w:end w:w="120" w:type="dxa"/>
+              <w:top w:w="70" w:type="dxa"/>
+              <w:start w:w="105" w:type="dxa"/>
+              <w:bottom w:w="70" w:type="dxa"/>
+              <w:end w:w="105" w:type="dxa"/>
             </w:tcMar>
             <w:shd w:fill="F2F6FA"/>
             <w:vAlign w:val="center"/>
@@ -3542,39 +1175,9 @@
             <w:r>
               <w:rPr>
                 <w:rFonts w:ascii="Aptos" w:hAnsi="Aptos"/>
-                <w:sz w:val="18"/>
+                <w:sz w:val="17"/>
               </w:rPr>
-              <w:t>name, role, introduction</w:t>
-            </w:r>
-          </w:p>
-        </w:tc>
-        <w:tc>
-          <w:tcPr>
-            <w:tcW w:type="dxa" w:w="2736"/>
-            <w:tcBorders>
-              <w:top w:val="single" w:sz="4" w:color="D9D9D9"/>
-              <w:left w:val="single" w:sz="4" w:color="D9D9D9"/>
-              <w:bottom w:val="single" w:sz="4" w:color="D9D9D9"/>
-              <w:right w:val="single" w:sz="4" w:color="D9D9D9"/>
-              <w:insideH w:val="single" w:sz="4" w:color="D9D9D9"/>
-              <w:insideV w:val="single" w:sz="4" w:color="D9D9D9"/>
-            </w:tcBorders>
-            <w:tcMar>
-              <w:top w:w="110" w:type="dxa"/>
-              <w:start w:w="120" w:type="dxa"/>
-              <w:bottom w:w="110" w:type="dxa"/>
-              <w:end w:w="120" w:type="dxa"/>
-            </w:tcMar>
-            <w:shd w:fill="F2F6FA"/>
-            <w:vAlign w:val="center"/>
-          </w:tcPr>
-          <w:p>
-            <w:r>
-              <w:rPr>
-                <w:rFonts w:ascii="Aptos" w:hAnsi="Aptos"/>
-                <w:sz w:val="18"/>
-              </w:rPr>
-              <w:t>Sets the three primary elements in the page header and introduction</w:t>
+              <w:t>127.0.0.1:8765 supports the complete browser demonstration.</w:t>
             </w:r>
           </w:p>
         </w:tc>
@@ -3585,7 +1188,7 @@
         </w:trPr>
         <w:tc>
           <w:tcPr>
-            <w:tcW w:type="dxa" w:w="1800"/>
+            <w:tcW w:type="dxa" w:w="2088"/>
             <w:tcBorders>
               <w:top w:val="single" w:sz="4" w:color="D9D9D9"/>
               <w:left w:val="single" w:sz="4" w:color="D9D9D9"/>
@@ -3595,10 +1198,10 @@
               <w:insideV w:val="single" w:sz="4" w:color="D9D9D9"/>
             </w:tcBorders>
             <w:tcMar>
-              <w:top w:w="110" w:type="dxa"/>
-              <w:start w:w="120" w:type="dxa"/>
-              <w:bottom w:w="110" w:type="dxa"/>
-              <w:end w:w="120" w:type="dxa"/>
+              <w:top w:w="70" w:type="dxa"/>
+              <w:start w:w="105" w:type="dxa"/>
+              <w:bottom w:w="70" w:type="dxa"/>
+              <w:end w:w="105" w:type="dxa"/>
             </w:tcMar>
             <w:vAlign w:val="center"/>
           </w:tcPr>
@@ -3606,15 +1209,15 @@
             <w:r>
               <w:rPr>
                 <w:rFonts w:ascii="Aptos" w:hAnsi="Aptos"/>
-                <w:sz w:val="18"/>
+                <w:sz w:val="17"/>
               </w:rPr>
-              <w:t>items</w:t>
+              <w:t>Real CV workflow</w:t>
             </w:r>
           </w:p>
         </w:tc>
         <w:tc>
           <w:tcPr>
-            <w:tcW w:type="dxa" w:w="5256"/>
+            <w:tcW w:type="dxa" w:w="7704"/>
             <w:tcBorders>
               <w:top w:val="single" w:sz="4" w:color="D9D9D9"/>
               <w:left w:val="single" w:sz="4" w:color="D9D9D9"/>
@@ -3624,10 +1227,10 @@
               <w:insideV w:val="single" w:sz="4" w:color="D9D9D9"/>
             </w:tcBorders>
             <w:tcMar>
-              <w:top w:w="110" w:type="dxa"/>
-              <w:start w:w="120" w:type="dxa"/>
-              <w:bottom w:w="110" w:type="dxa"/>
-              <w:end w:w="120" w:type="dxa"/>
+              <w:top w:w="70" w:type="dxa"/>
+              <w:start w:w="105" w:type="dxa"/>
+              <w:bottom w:w="70" w:type="dxa"/>
+              <w:end w:w="105" w:type="dxa"/>
             </w:tcMar>
             <w:vAlign w:val="center"/>
           </w:tcPr>
@@ -3635,38 +1238,9 @@
             <w:r>
               <w:rPr>
                 <w:rFonts w:ascii="Aptos" w:hAnsi="Aptos"/>
-                <w:sz w:val="18"/>
+                <w:sz w:val="17"/>
               </w:rPr>
-              <w:t>category, label, value, status, source, user_decision</w:t>
-            </w:r>
-          </w:p>
-        </w:tc>
-        <w:tc>
-          <w:tcPr>
-            <w:tcW w:type="dxa" w:w="2736"/>
-            <w:tcBorders>
-              <w:top w:val="single" w:sz="4" w:color="D9D9D9"/>
-              <w:left w:val="single" w:sz="4" w:color="D9D9D9"/>
-              <w:bottom w:val="single" w:sz="4" w:color="D9D9D9"/>
-              <w:right w:val="single" w:sz="4" w:color="D9D9D9"/>
-              <w:insideH w:val="single" w:sz="4" w:color="D9D9D9"/>
-              <w:insideV w:val="single" w:sz="4" w:color="D9D9D9"/>
-            </w:tcBorders>
-            <w:tcMar>
-              <w:top w:w="110" w:type="dxa"/>
-              <w:start w:w="120" w:type="dxa"/>
-              <w:bottom w:w="110" w:type="dxa"/>
-              <w:end w:w="120" w:type="dxa"/>
-            </w:tcMar>
-            <w:vAlign w:val="center"/>
-          </w:tcPr>
-          <w:p>
-            <w:r>
-              <w:rPr>
-                <w:rFonts w:ascii="Aptos" w:hAnsi="Aptos"/>
-                <w:sz w:val="18"/>
-              </w:rPr>
-              <w:t>Adds education, projects, experience, skills, or other supported content</w:t>
+              <w:t>A DOCX CV can be parsed, reviewed by DeepSeek Flash, converted to a profile, and exported locally.</w:t>
             </w:r>
           </w:p>
         </w:tc>
@@ -3677,7 +1251,7 @@
         </w:trPr>
         <w:tc>
           <w:tcPr>
-            <w:tcW w:type="dxa" w:w="1800"/>
+            <w:tcW w:type="dxa" w:w="2088"/>
             <w:tcBorders>
               <w:top w:val="single" w:sz="4" w:color="D9D9D9"/>
               <w:left w:val="single" w:sz="4" w:color="D9D9D9"/>
@@ -3687,10 +1261,10 @@
               <w:insideV w:val="single" w:sz="4" w:color="D9D9D9"/>
             </w:tcBorders>
             <w:tcMar>
-              <w:top w:w="110" w:type="dxa"/>
-              <w:start w:w="120" w:type="dxa"/>
-              <w:bottom w:w="110" w:type="dxa"/>
-              <w:end w:w="120" w:type="dxa"/>
+              <w:top w:w="70" w:type="dxa"/>
+              <w:start w:w="105" w:type="dxa"/>
+              <w:bottom w:w="70" w:type="dxa"/>
+              <w:end w:w="105" w:type="dxa"/>
             </w:tcMar>
             <w:shd w:fill="F2F6FA"/>
             <w:vAlign w:val="center"/>
@@ -3699,15 +1273,15 @@
             <w:r>
               <w:rPr>
                 <w:rFonts w:ascii="Aptos" w:hAnsi="Aptos"/>
-                <w:sz w:val="18"/>
+                <w:sz w:val="17"/>
               </w:rPr>
-              <w:t>design</w:t>
+              <w:t>Privacy and fallback</w:t>
             </w:r>
           </w:p>
         </w:tc>
         <w:tc>
           <w:tcPr>
-            <w:tcW w:type="dxa" w:w="5256"/>
+            <w:tcW w:type="dxa" w:w="7704"/>
             <w:tcBorders>
               <w:top w:val="single" w:sz="4" w:color="D9D9D9"/>
               <w:left w:val="single" w:sz="4" w:color="D9D9D9"/>
@@ -3717,10 +1291,10 @@
               <w:insideV w:val="single" w:sz="4" w:color="D9D9D9"/>
             </w:tcBorders>
             <w:tcMar>
-              <w:top w:w="110" w:type="dxa"/>
-              <w:start w:w="120" w:type="dxa"/>
-              <w:bottom w:w="110" w:type="dxa"/>
-              <w:end w:w="120" w:type="dxa"/>
+              <w:top w:w="70" w:type="dxa"/>
+              <w:start w:w="105" w:type="dxa"/>
+              <w:bottom w:w="70" w:type="dxa"/>
+              <w:end w:w="105" w:type="dxa"/>
             </w:tcMar>
             <w:shd w:fill="F2F6FA"/>
             <w:vAlign w:val="center"/>
@@ -3729,39 +1303,9 @@
             <w:r>
               <w:rPr>
                 <w:rFonts w:ascii="Aptos" w:hAnsi="Aptos"/>
-                <w:sz w:val="18"/>
+                <w:sz w:val="17"/>
               </w:rPr>
-              <w:t>theme, accent_color, font_style, layout_density</w:t>
-            </w:r>
-          </w:p>
-        </w:tc>
-        <w:tc>
-          <w:tcPr>
-            <w:tcW w:type="dxa" w:w="2736"/>
-            <w:tcBorders>
-              <w:top w:val="single" w:sz="4" w:color="D9D9D9"/>
-              <w:left w:val="single" w:sz="4" w:color="D9D9D9"/>
-              <w:bottom w:val="single" w:sz="4" w:color="D9D9D9"/>
-              <w:right w:val="single" w:sz="4" w:color="D9D9D9"/>
-              <w:insideH w:val="single" w:sz="4" w:color="D9D9D9"/>
-              <w:insideV w:val="single" w:sz="4" w:color="D9D9D9"/>
-            </w:tcBorders>
-            <w:tcMar>
-              <w:top w:w="110" w:type="dxa"/>
-              <w:start w:w="120" w:type="dxa"/>
-              <w:bottom w:w="110" w:type="dxa"/>
-              <w:end w:w="120" w:type="dxa"/>
-            </w:tcMar>
-            <w:shd w:fill="F2F6FA"/>
-            <w:vAlign w:val="center"/>
-          </w:tcPr>
-          <w:p>
-            <w:r>
-              <w:rPr>
-                <w:rFonts w:ascii="Aptos" w:hAnsi="Aptos"/>
-                <w:sz w:val="18"/>
-              </w:rPr>
-              <w:t>Controls presentation and PDF styling</w:t>
+              <w:t>.env, sessions, and personal outputs are ignored by Git; the fictional demo and default_config.json work without a model call.</w:t>
             </w:r>
           </w:p>
         </w:tc>
@@ -3774,10 +1318,43 @@
     </w:p>
     <w:p>
       <w:pPr>
-        <w:keepLines/>
+        <w:pStyle w:val="Heading1"/>
+        <w:keepNext/>
       </w:pPr>
       <w:r>
-        <w:t>Accepted design values are academic, modern, or minimal for theme; serif, sans, or hybrid for font_style; and compact, balanced, or airy for layout_density. accent_color must be a six-digit hexadecimal color such as #147D70.</w:t>
+        <w:t>Known Limitations</w:t>
+      </w:r>
+    </w:p>
+    <w:p>
+      <w:pPr>
+        <w:pStyle w:val="ListBullet"/>
+      </w:pPr>
+      <w:r>
+        <w:t>Gemini credentials can be tested, but Gemini is not yet a conversation option in the web selector.</w:t>
+      </w:r>
+    </w:p>
+    <w:p>
+      <w:pPr>
+        <w:pStyle w:val="ListBullet"/>
+      </w:pPr>
+      <w:r>
+        <w:t>Image interpretation, approved portrait placement, and drag-and-drop section reordering remain future work.</w:t>
+      </w:r>
+    </w:p>
+    <w:p>
+      <w:pPr>
+        <w:pStyle w:val="ListBullet"/>
+      </w:pPr>
+      <w:r>
+        <w:t>The exporter prioritizes a single page and may omit lower-priority overflow; users must review the final PDF.</w:t>
+      </w:r>
+    </w:p>
+    <w:p>
+      <w:pPr>
+        <w:pStyle w:val="ListBullet"/>
+      </w:pPr>
+      <w:r>
+        <w:t>Formal accessibility, institutional policy, and factual accuracy still require human review.</w:t>
       </w:r>
     </w:p>
     <w:p>
@@ -3786,76 +1363,22 @@
         <w:keepNext/>
       </w:pPr>
       <w:r>
-        <w:t>Appendix C Preclass Checklist</w:t>
+        <w:t>Preclass Checklist</w:t>
       </w:r>
     </w:p>
     <w:p>
       <w:pPr>
-        <w:pStyle w:val="ListBullet"/>
+        <w:keepLines/>
       </w:pPr>
       <w:r>
-        <w:t>Run python -m profilekit.preflight and confirm every local check passes.</w:t>
-      </w:r>
-    </w:p>
-    <w:p>
-      <w:pPr>
-        <w:pStyle w:val="ListBullet"/>
-      </w:pPr>
-      <w:r>
-        <w:t>Open the local page before class and confirm the header shows DeepSeek Flash and local session.</w:t>
-      </w:r>
-    </w:p>
-    <w:p>
-      <w:pPr>
-        <w:pStyle w:val="ListBullet"/>
-      </w:pPr>
-      <w:r>
-        <w:t>Click Load demo and confirm the preview displays a fictional profile rather than personal information.</w:t>
-      </w:r>
-    </w:p>
-    <w:p>
-      <w:pPr>
-        <w:pStyle w:val="ListBullet"/>
-      </w:pPr>
-      <w:r>
-        <w:t>Open Customize once and verify the dialog fits the projector resolution.</w:t>
-      </w:r>
-    </w:p>
-    <w:p>
-      <w:pPr>
-        <w:pStyle w:val="ListBullet"/>
-      </w:pPr>
-      <w:r>
-        <w:t>Export a PDF and confirm it opens as one page.</w:t>
-      </w:r>
-    </w:p>
-    <w:p>
-      <w:pPr>
-        <w:pStyle w:val="ListBullet"/>
-      </w:pPr>
-      <w:r>
-        <w:t>Keep default_config.json available as a no-model fallback.</w:t>
-      </w:r>
-    </w:p>
-    <w:p>
-      <w:pPr>
-        <w:pStyle w:val="ListBullet"/>
-      </w:pPr>
-      <w:r>
-        <w:t>Do not display .env or API keys during the presentation.</w:t>
-      </w:r>
-    </w:p>
-    <w:p>
-      <w:pPr>
-        <w:pStyle w:val="ListBullet"/>
-      </w:pPr>
-      <w:r>
-        <w:t>If classroom internet is unavailable, demonstrate the built-in demo, configuration import, customization, privacy controls, themes, and PDF export; those functions do not require a model call.</w:t>
+        <w:t>Run python -m profilekit.preflight, open http://127.0.0.1:8765, load the fictional demo, test Customize, and export one PDF. Keep default_config.json available as the no-model fallback, and never display the .env file or API keys during class.</w:t>
       </w:r>
     </w:p>
     <w:sectPr>
+      <w:headerReference w:type="default" r:id="rId9"/>
+      <w:footerReference w:type="default" r:id="rId10"/>
       <w:pgSz w:w="12240" w:h="15840"/>
-      <w:pgMar w:top="1037" w:right="1181" w:bottom="979" w:left="1181" w:header="720" w:footer="720" w:gutter="0"/>
+      <w:pgMar w:top="792" w:right="1037" w:bottom="792" w:left="1037" w:header="720" w:footer="720" w:gutter="0"/>
       <w:cols w:space="720"/>
       <w:docGrid w:linePitch="360"/>
     </w:sectPr>
@@ -4268,11 +1791,11 @@
     <w:qFormat/>
     <w:rsid w:val="00FC693F"/>
     <w:pPr>
-      <w:spacing w:after="120" w:line="269" w:lineRule="auto"/>
+      <w:spacing w:after="60" w:line="247" w:lineRule="auto"/>
     </w:pPr>
     <w:rPr>
       <w:rFonts w:ascii="Aptos" w:hAnsi="Aptos"/>
-      <w:sz w:val="21"/>
+      <w:sz w:val="19"/>
     </w:rPr>
   </w:style>
   <w:style w:type="paragraph" w:styleId="Header">
@@ -4330,7 +1853,7 @@
     <w:pPr>
       <w:keepNext/>
       <w:keepLines/>
-      <w:spacing w:before="320" w:after="140"/>
+      <w:spacing w:before="160" w:after="80"/>
       <w:outlineLvl w:val="0"/>
     </w:pPr>
     <w:rPr>
@@ -4338,7 +1861,7 @@
       <w:b/>
       <w:bCs/>
       <w:color w:val="000000"/>
-      <w:sz w:val="36"/>
+      <w:sz w:val="30"/>
       <w:szCs w:val="28"/>
     </w:rPr>
   </w:style>
@@ -4362,7 +1885,7 @@
       <w:b/>
       <w:bCs/>
       <w:color w:val="000000"/>
-      <w:sz w:val="26"/>
+      <w:sz w:val="24"/>
       <w:szCs w:val="26"/>
     </w:rPr>
   </w:style>
@@ -4616,7 +2139,7 @@
     <w:qFormat/>
     <w:rsid w:val="00FC693F"/>
     <w:pPr>
-      <w:spacing w:after="240" w:line="240" w:lineRule="auto"/>
+      <w:spacing w:after="120" w:line="240" w:lineRule="auto"/>
       <w:contextualSpacing/>
     </w:pPr>
     <w:rPr>
@@ -4625,7 +2148,7 @@
       <w:color w:val="000000"/>
       <w:spacing w:val="5"/>
       <w:kern w:val="28"/>
-      <w:sz w:val="56"/>
+      <w:sz w:val="48"/>
       <w:szCs w:val="52"/>
     </w:rPr>
   </w:style>

</xml_diff>